<commit_message>
updates to the exercises
</commit_message>
<xml_diff>
--- a/tutorials/BHJet_student_workbook.docx
+++ b/tutorials/BHJet_student_workbook.docx
@@ -1,6 +1,6 @@
 
 <file path=word/document.xml><?xml version="1.0" encoding="utf-8"?>
-<w:document xmlns:wpc="http://schemas.microsoft.com/office/word/2010/wordprocessingCanvas" xmlns:cx="http://schemas.microsoft.com/office/drawing/2014/chartex" xmlns:cx1="http://schemas.microsoft.com/office/drawing/2015/9/8/chartex" xmlns:cx2="http://schemas.microsoft.com/office/drawing/2015/10/21/chartex" xmlns:cx3="http://schemas.microsoft.com/office/drawing/2016/5/9/chartex" xmlns:cx4="http://schemas.microsoft.com/office/drawing/2016/5/10/chartex" xmlns:cx5="http://schemas.microsoft.com/office/drawing/2016/5/11/chartex" xmlns:cx6="http://schemas.microsoft.com/office/drawing/2016/5/12/chartex" xmlns:cx7="http://schemas.microsoft.com/office/drawing/2016/5/13/chartex" xmlns:cx8="http://schemas.microsoft.com/office/drawing/2016/5/14/chartex" xmlns:mc="http://schemas.openxmlformats.org/markup-compatibility/2006" xmlns:m="http://schemas.openxmlformats.org/officeDocument/2006/math" xmlns:aink="http://schemas.microsoft.com/office/drawing/2016/ink" xmlns:am3d="http://schemas.microsoft.com/office/drawing/2017/model3d" xmlns:oel="http://schemas.microsoft.com/office/2019/extlst" xmlns:r="http://schemas.openxmlformats.org/officeDocument/2006/relationships" xmlns:wp14="http://schemas.microsoft.com/office/word/2010/wordprocessingDrawing" xmlns:wp="http://schemas.openxmlformats.org/drawingml/2006/wordprocessingDrawing" xmlns:wpg="http://schemas.microsoft.com/office/word/2010/wordprocessingGroup" xmlns:wpi="http://schemas.microsoft.com/office/word/2010/wordprocessingInk" xmlns:wps="http://schemas.microsoft.com/office/word/2010/wordprocessingShape" xmlns:o="urn:schemas-microsoft-com:office:office" xmlns:v="urn:schemas-microsoft-com:vml" xmlns:w10="urn:schemas-microsoft-com:office:word" xmlns:w="http://schemas.openxmlformats.org/wordprocessingml/2006/main" xmlns:w14="http://schemas.microsoft.com/office/word/2010/wordml" xmlns:w15="http://schemas.microsoft.com/office/word/2012/wordml" xmlns:w16cei="http://schemas.microsoft.com/office/word/2026/wordml/cei" xmlns:w16cex="http://schemas.microsoft.com/office/word/2018/wordml/cex" xmlns:w16cid="http://schemas.microsoft.com/office/word/2016/wordml/cid" xmlns:w16="http://schemas.microsoft.com/office/word/2018/wordml" xmlns:w16sdtdh="http://schemas.microsoft.com/office/word/2020/wordml/sdtdatahash" xmlns:w16sdtfl="http://schemas.microsoft.com/office/word/2024/wordml/sdtformatlock" xmlns:w16se="http://schemas.microsoft.com/office/word/2015/wordml/symex" xmlns:w16du="http://schemas.microsoft.com/office/word/2023/wordml/word16du" xmlns:wne="http://schemas.microsoft.com/office/word/2006/wordml" mc:Ignorable="w14 w15 w16se w16cid w16 w16cex w16sdtdh w16sdtfl w16du wp14">
+<w:document xmlns:wpc="http://schemas.microsoft.com/office/word/2010/wordprocessingCanvas" xmlns:cx="http://schemas.microsoft.com/office/drawing/2014/chartex" xmlns:cx1="http://schemas.microsoft.com/office/drawing/2015/9/8/chartex" xmlns:cx2="http://schemas.microsoft.com/office/drawing/2015/10/21/chartex" xmlns:cx3="http://schemas.microsoft.com/office/drawing/2016/5/9/chartex" xmlns:cx4="http://schemas.microsoft.com/office/drawing/2016/5/10/chartex" xmlns:cx5="http://schemas.microsoft.com/office/drawing/2016/5/11/chartex" xmlns:cx6="http://schemas.microsoft.com/office/drawing/2016/5/12/chartex" xmlns:cx7="http://schemas.microsoft.com/office/drawing/2016/5/13/chartex" xmlns:cx8="http://schemas.microsoft.com/office/drawing/2016/5/14/chartex" xmlns:mc="http://schemas.openxmlformats.org/markup-compatibility/2006" xmlns:m="http://schemas.openxmlformats.org/officeDocument/2006/math" xmlns:aink="http://schemas.microsoft.com/office/drawing/2016/ink" xmlns:am3d="http://schemas.microsoft.com/office/drawing/2017/model3d" xmlns:oel="http://schemas.microsoft.com/office/2019/extlst" xmlns:r="http://schemas.openxmlformats.org/officeDocument/2006/relationships" xmlns:wp14="http://schemas.microsoft.com/office/word/2010/wordprocessingDrawing" xmlns:wp="http://schemas.openxmlformats.org/drawingml/2006/wordprocessingDrawing" xmlns:wpg="http://schemas.microsoft.com/office/word/2010/wordprocessingGroup" xmlns:wpi="http://schemas.microsoft.com/office/word/2010/wordprocessingInk" xmlns:wps="http://schemas.microsoft.com/office/word/2010/wordprocessingShape" xmlns:o="urn:schemas-microsoft-com:office:office" xmlns:v="urn:schemas-microsoft-com:vml" xmlns:w10="urn:schemas-microsoft-com:office:word" xmlns:w="http://schemas.openxmlformats.org/wordprocessingml/2006/main" xmlns:w14="http://schemas.microsoft.com/office/word/2010/wordml" xmlns:w15="http://schemas.microsoft.com/office/word/2012/wordml" xmlns:w16cex="http://schemas.microsoft.com/office/word/2018/wordml/cex" xmlns:w16cid="http://schemas.microsoft.com/office/word/2016/wordml/cid" xmlns:w16="http://schemas.microsoft.com/office/word/2018/wordml" xmlns:w16sdtdh="http://schemas.microsoft.com/office/word/2020/wordml/sdtdatahash" xmlns:w16sdtfl="http://schemas.microsoft.com/office/word/2024/wordml/sdtformatlock" xmlns:w16se="http://schemas.microsoft.com/office/word/2015/wordml/symex" xmlns:w16du="http://schemas.microsoft.com/office/word/2023/wordml/word16du" xmlns:wne="http://schemas.microsoft.com/office/word/2006/wordml" mc:Ignorable="w14 w15 w16se w16cid w16 w16cex w16sdtdh w16sdtfl w16du wp14">
   <w:body>
     <w:p>
       <w:pPr>
@@ -24,12 +24,16 @@
         <w:rPr>
           <w:rFonts w:asciiTheme="minorHAnsi" w:hAnsiTheme="minorHAnsi"/>
           <w:color w:val="1F497D" w:themeColor="text2"/>
-        </w:rPr>
-      </w:pPr>
-      <w:r>
-        <w:rPr>
-          <w:rFonts w:asciiTheme="minorHAnsi" w:hAnsiTheme="minorHAnsi"/>
-          <w:color w:val="1F497D" w:themeColor="text2"/>
+          <w:sz w:val="24"/>
+          <w:szCs w:val="24"/>
+        </w:rPr>
+      </w:pPr>
+      <w:r>
+        <w:rPr>
+          <w:rFonts w:asciiTheme="minorHAnsi" w:hAnsiTheme="minorHAnsi"/>
+          <w:color w:val="1F497D" w:themeColor="text2"/>
+          <w:sz w:val="24"/>
+          <w:szCs w:val="24"/>
         </w:rPr>
         <w:t xml:space="preserve">Please </w:t>
       </w:r>
@@ -37,6 +41,8 @@
         <w:rPr>
           <w:rFonts w:asciiTheme="minorHAnsi" w:hAnsiTheme="minorHAnsi"/>
           <w:color w:val="1F497D" w:themeColor="text2"/>
+          <w:sz w:val="24"/>
+          <w:szCs w:val="24"/>
         </w:rPr>
         <w:t xml:space="preserve">make sure to </w:t>
       </w:r>
@@ -44,34 +50,17 @@
         <w:rPr>
           <w:rFonts w:asciiTheme="minorHAnsi" w:hAnsiTheme="minorHAnsi"/>
           <w:color w:val="1F497D" w:themeColor="text2"/>
-        </w:rPr>
-        <w:t>use</w:t>
-      </w:r>
-      <w:r>
-        <w:rPr>
-          <w:rFonts w:asciiTheme="minorHAnsi" w:hAnsiTheme="minorHAnsi"/>
-          <w:color w:val="1F497D" w:themeColor="text2"/>
-        </w:rPr>
-        <w:t xml:space="preserve"> this document locally alongside the Binder tutorials</w:t>
-      </w:r>
-      <w:r>
-        <w:rPr>
-          <w:rFonts w:asciiTheme="minorHAnsi" w:hAnsiTheme="minorHAnsi"/>
-          <w:color w:val="1F497D" w:themeColor="text2"/>
-        </w:rPr>
-        <w:t xml:space="preserve"> to save your work;</w:t>
-      </w:r>
-      <w:r>
-        <w:rPr>
-          <w:rFonts w:asciiTheme="minorHAnsi" w:hAnsiTheme="minorHAnsi"/>
-          <w:color w:val="1F497D" w:themeColor="text2"/>
-        </w:rPr>
-        <w:t xml:space="preserve"> paste or drag screenshots of your plots into the </w:t>
-      </w:r>
-      <w:r>
-        <w:rPr>
-          <w:rFonts w:asciiTheme="minorHAnsi" w:hAnsiTheme="minorHAnsi"/>
-          <w:color w:val="1F497D" w:themeColor="text2"/>
+          <w:sz w:val="24"/>
+          <w:szCs w:val="24"/>
+        </w:rPr>
+        <w:t xml:space="preserve">use this document locally alongside the Binder tutorials to save your work; paste or drag screenshots of your plots into the </w:t>
+      </w:r>
+      <w:r>
+        <w:rPr>
+          <w:rFonts w:asciiTheme="minorHAnsi" w:hAnsiTheme="minorHAnsi"/>
+          <w:color w:val="1F497D" w:themeColor="text2"/>
+          <w:sz w:val="24"/>
+          <w:szCs w:val="24"/>
         </w:rPr>
         <w:t xml:space="preserve">grey </w:t>
       </w:r>
@@ -79,20 +68,17 @@
         <w:rPr>
           <w:rFonts w:asciiTheme="minorHAnsi" w:hAnsiTheme="minorHAnsi"/>
           <w:color w:val="1F497D" w:themeColor="text2"/>
-        </w:rPr>
-        <w:t>screenshot spaces</w:t>
-      </w:r>
-      <w:r>
-        <w:rPr>
-          <w:rFonts w:asciiTheme="minorHAnsi" w:hAnsiTheme="minorHAnsi"/>
-          <w:color w:val="1F497D" w:themeColor="text2"/>
-        </w:rPr>
-        <w:t xml:space="preserve"> and keep notes of what you have experimented with</w:t>
-      </w:r>
-      <w:r>
-        <w:rPr>
-          <w:rFonts w:asciiTheme="minorHAnsi" w:hAnsiTheme="minorHAnsi"/>
-          <w:color w:val="1F497D" w:themeColor="text2"/>
+          <w:sz w:val="24"/>
+          <w:szCs w:val="24"/>
+        </w:rPr>
+        <w:t>screenshot spaces and keep notes of what you have experimented with</w:t>
+      </w:r>
+      <w:r>
+        <w:rPr>
+          <w:rFonts w:asciiTheme="minorHAnsi" w:hAnsiTheme="minorHAnsi"/>
+          <w:color w:val="1F497D" w:themeColor="text2"/>
+          <w:sz w:val="24"/>
+          <w:szCs w:val="24"/>
         </w:rPr>
         <w:t>, as binder won’t save any progress if you have to reload/restart!</w:t>
       </w:r>
@@ -128,15 +114,7 @@
           <w:color w:val="1F497D" w:themeColor="text2"/>
           <w:sz w:val="40"/>
         </w:rPr>
-        <w:t xml:space="preserve"> Notebook: </w:t>
-      </w:r>
-      <w:r>
-        <w:rPr>
-          <w:rFonts w:asciiTheme="minorHAnsi" w:hAnsiTheme="minorHAnsi"/>
-          <w:color w:val="1F497D" w:themeColor="text2"/>
-          <w:sz w:val="40"/>
-        </w:rPr>
-        <w:t>Interactive parameter explorer</w:t>
+        <w:t xml:space="preserve"> Notebook: Interactive parameter explorer</w:t>
       </w:r>
     </w:p>
     <w:p>
@@ -144,30 +122,34 @@
         <w:rPr>
           <w:rFonts w:asciiTheme="minorHAnsi" w:hAnsiTheme="minorHAnsi"/>
           <w:color w:val="1F497D" w:themeColor="text2"/>
-        </w:rPr>
-      </w:pPr>
-      <w:r>
-        <w:rPr>
-          <w:rFonts w:asciiTheme="minorHAnsi" w:hAnsiTheme="minorHAnsi"/>
-          <w:color w:val="1F497D" w:themeColor="text2"/>
-        </w:rPr>
-        <w:t xml:space="preserve">This is </w:t>
-      </w:r>
-      <w:proofErr w:type="spellStart"/>
-      <w:proofErr w:type="gramStart"/>
-      <w:r>
-        <w:rPr>
-          <w:rFonts w:asciiTheme="minorHAnsi" w:hAnsiTheme="minorHAnsi"/>
-          <w:color w:val="1F497D" w:themeColor="text2"/>
-        </w:rPr>
-        <w:t>a</w:t>
-      </w:r>
-      <w:proofErr w:type="spellEnd"/>
-      <w:proofErr w:type="gramEnd"/>
-      <w:r>
-        <w:rPr>
-          <w:rFonts w:asciiTheme="minorHAnsi" w:hAnsiTheme="minorHAnsi"/>
-          <w:color w:val="1F497D" w:themeColor="text2"/>
+          <w:sz w:val="24"/>
+          <w:szCs w:val="24"/>
+        </w:rPr>
+      </w:pPr>
+      <w:r>
+        <w:rPr>
+          <w:rFonts w:asciiTheme="minorHAnsi" w:hAnsiTheme="minorHAnsi"/>
+          <w:color w:val="1F497D" w:themeColor="text2"/>
+          <w:sz w:val="24"/>
+          <w:szCs w:val="24"/>
+        </w:rPr>
+        <w:t>This is a</w:t>
+      </w:r>
+      <w:r>
+        <w:rPr>
+          <w:rFonts w:asciiTheme="minorHAnsi" w:hAnsiTheme="minorHAnsi"/>
+          <w:color w:val="1F497D" w:themeColor="text2"/>
+          <w:sz w:val="24"/>
+          <w:szCs w:val="24"/>
+        </w:rPr>
+        <w:t>n</w:t>
+      </w:r>
+      <w:r>
+        <w:rPr>
+          <w:rFonts w:asciiTheme="minorHAnsi" w:hAnsiTheme="minorHAnsi"/>
+          <w:color w:val="1F497D" w:themeColor="text2"/>
+          <w:sz w:val="24"/>
+          <w:szCs w:val="24"/>
         </w:rPr>
         <w:t xml:space="preserve"> interactive plot that will allow you to see what the parameters in BHJet control, and how they impact the total emission. </w:t>
       </w:r>
@@ -175,6 +157,8 @@
         <w:rPr>
           <w:rFonts w:asciiTheme="minorHAnsi" w:hAnsiTheme="minorHAnsi"/>
           <w:color w:val="1F497D" w:themeColor="text2"/>
+          <w:sz w:val="24"/>
+          <w:szCs w:val="24"/>
         </w:rPr>
         <w:t>They have been initially set for a supermassive black hole in a nearby galaxy, at a high inclination angle</w:t>
       </w:r>
@@ -182,13 +166,35 @@
         <w:rPr>
           <w:rFonts w:asciiTheme="minorHAnsi" w:hAnsiTheme="minorHAnsi"/>
           <w:color w:val="1F497D" w:themeColor="text2"/>
-        </w:rPr>
-        <w:t>, but you can change them yourself. We’ve put a lot of parameters into log10 (and they are labeled as such</w:t>
-      </w:r>
-      <w:r>
-        <w:rPr>
-          <w:rFonts w:asciiTheme="minorHAnsi" w:hAnsiTheme="minorHAnsi"/>
-          <w:color w:val="1F497D" w:themeColor="text2"/>
+          <w:sz w:val="24"/>
+          <w:szCs w:val="24"/>
+        </w:rPr>
+        <w:t>, but you can change them yourself</w:t>
+      </w:r>
+      <w:r>
+        <w:rPr>
+          <w:rFonts w:asciiTheme="minorHAnsi" w:hAnsiTheme="minorHAnsi"/>
+          <w:color w:val="1F497D" w:themeColor="text2"/>
+          <w:sz w:val="24"/>
+          <w:szCs w:val="24"/>
+        </w:rPr>
+        <w:t xml:space="preserve"> as you go along</w:t>
+      </w:r>
+      <w:r>
+        <w:rPr>
+          <w:rFonts w:asciiTheme="minorHAnsi" w:hAnsiTheme="minorHAnsi"/>
+          <w:color w:val="1F497D" w:themeColor="text2"/>
+          <w:sz w:val="24"/>
+          <w:szCs w:val="24"/>
+        </w:rPr>
+        <w:t>. We’ve put a lot of parameters into log10 (and they are labeled as such</w:t>
+      </w:r>
+      <w:r>
+        <w:rPr>
+          <w:rFonts w:asciiTheme="minorHAnsi" w:hAnsiTheme="minorHAnsi"/>
+          <w:color w:val="1F497D" w:themeColor="text2"/>
+          <w:sz w:val="24"/>
+          <w:szCs w:val="24"/>
         </w:rPr>
         <w:t xml:space="preserve">). </w:t>
       </w:r>
@@ -196,6 +202,8 @@
         <w:rPr>
           <w:rFonts w:asciiTheme="minorHAnsi" w:hAnsiTheme="minorHAnsi"/>
           <w:color w:val="1F497D" w:themeColor="text2"/>
+          <w:sz w:val="24"/>
+          <w:szCs w:val="24"/>
         </w:rPr>
         <w:t xml:space="preserve"> </w:t>
       </w:r>
@@ -210,14 +218,36 @@
         <w:rPr>
           <w:rFonts w:asciiTheme="minorHAnsi" w:hAnsiTheme="minorHAnsi"/>
           <w:color w:val="1F497D" w:themeColor="text2"/>
-        </w:rPr>
-      </w:pPr>
-      <w:r>
-        <w:rPr>
-          <w:rFonts w:asciiTheme="minorHAnsi" w:hAnsiTheme="minorHAnsi"/>
-          <w:color w:val="1F497D" w:themeColor="text2"/>
-        </w:rPr>
-        <w:t xml:space="preserve">The first set of parameters, </w:t>
+          <w:sz w:val="24"/>
+          <w:szCs w:val="24"/>
+        </w:rPr>
+      </w:pPr>
+      <w:r>
+        <w:rPr>
+          <w:rFonts w:asciiTheme="minorHAnsi" w:hAnsiTheme="minorHAnsi"/>
+          <w:color w:val="1F497D" w:themeColor="text2"/>
+          <w:sz w:val="24"/>
+          <w:szCs w:val="24"/>
+        </w:rPr>
+        <w:t>The first set of parameters</w:t>
+      </w:r>
+      <w:r>
+        <w:rPr>
+          <w:rFonts w:asciiTheme="minorHAnsi" w:hAnsiTheme="minorHAnsi"/>
+          <w:color w:val="1F497D" w:themeColor="text2"/>
+          <w:sz w:val="24"/>
+          <w:szCs w:val="24"/>
+        </w:rPr>
+        <w:t xml:space="preserve"> in this notebook</w:t>
+      </w:r>
+      <w:r>
+        <w:rPr>
+          <w:rFonts w:asciiTheme="minorHAnsi" w:hAnsiTheme="minorHAnsi"/>
+          <w:color w:val="1F497D" w:themeColor="text2"/>
+          <w:sz w:val="24"/>
+          <w:szCs w:val="24"/>
+        </w:rPr>
+        <w:t xml:space="preserve">, </w:t>
       </w:r>
       <w:r>
         <w:rPr>
@@ -225,6 +255,8 @@
           <w:b/>
           <w:bCs/>
           <w:color w:val="1F497D" w:themeColor="text2"/>
+          <w:sz w:val="24"/>
+          <w:szCs w:val="24"/>
         </w:rPr>
         <w:t xml:space="preserve">Source and Viewing Geometry, </w:t>
       </w:r>
@@ -232,6 +264,8 @@
         <w:rPr>
           <w:rFonts w:asciiTheme="minorHAnsi" w:hAnsiTheme="minorHAnsi"/>
           <w:color w:val="1F497D" w:themeColor="text2"/>
+          <w:sz w:val="24"/>
+          <w:szCs w:val="24"/>
         </w:rPr>
         <w:t>are specific to the object that we’re working on, and none of these are left to vary after they are set</w:t>
       </w:r>
@@ -239,6 +273,8 @@
         <w:rPr>
           <w:rFonts w:asciiTheme="minorHAnsi" w:hAnsiTheme="minorHAnsi"/>
           <w:color w:val="1F497D" w:themeColor="text2"/>
+          <w:sz w:val="24"/>
+          <w:szCs w:val="24"/>
         </w:rPr>
         <w:t xml:space="preserve">, as these are not parameters that can be fit for. </w:t>
       </w:r>
@@ -253,12 +289,16 @@
         <w:rPr>
           <w:rFonts w:asciiTheme="minorHAnsi" w:hAnsiTheme="minorHAnsi"/>
           <w:color w:val="1F497D" w:themeColor="text2"/>
-        </w:rPr>
-      </w:pPr>
-      <w:r>
-        <w:rPr>
-          <w:rFonts w:asciiTheme="minorHAnsi" w:hAnsiTheme="minorHAnsi"/>
-          <w:color w:val="1F497D" w:themeColor="text2"/>
+          <w:sz w:val="24"/>
+          <w:szCs w:val="24"/>
+        </w:rPr>
+      </w:pPr>
+      <w:r>
+        <w:rPr>
+          <w:rFonts w:asciiTheme="minorHAnsi" w:hAnsiTheme="minorHAnsi"/>
+          <w:color w:val="1F497D" w:themeColor="text2"/>
+          <w:sz w:val="24"/>
+          <w:szCs w:val="24"/>
         </w:rPr>
         <w:t xml:space="preserve">The second set, </w:t>
       </w:r>
@@ -268,6 +308,8 @@
           <w:b/>
           <w:bCs/>
           <w:color w:val="1F497D" w:themeColor="text2"/>
+          <w:sz w:val="24"/>
+          <w:szCs w:val="24"/>
         </w:rPr>
         <w:t xml:space="preserve">Jet Structure and Dynamics, </w:t>
       </w:r>
@@ -275,6 +317,8 @@
         <w:rPr>
           <w:rFonts w:asciiTheme="minorHAnsi" w:hAnsiTheme="minorHAnsi"/>
           <w:color w:val="1F497D" w:themeColor="text2"/>
+          <w:sz w:val="24"/>
+          <w:szCs w:val="24"/>
         </w:rPr>
         <w:t xml:space="preserve">are related to the shape and acceleration that the jet will have. </w:t>
       </w:r>
@@ -289,12 +333,16 @@
         <w:rPr>
           <w:rFonts w:asciiTheme="minorHAnsi" w:hAnsiTheme="minorHAnsi"/>
           <w:color w:val="1F497D" w:themeColor="text2"/>
-        </w:rPr>
-      </w:pPr>
-      <w:r>
-        <w:rPr>
-          <w:rFonts w:asciiTheme="minorHAnsi" w:hAnsiTheme="minorHAnsi"/>
-          <w:color w:val="1F497D" w:themeColor="text2"/>
+          <w:sz w:val="24"/>
+          <w:szCs w:val="24"/>
+        </w:rPr>
+      </w:pPr>
+      <w:r>
+        <w:rPr>
+          <w:rFonts w:asciiTheme="minorHAnsi" w:hAnsiTheme="minorHAnsi"/>
+          <w:color w:val="1F497D" w:themeColor="text2"/>
+          <w:sz w:val="24"/>
+          <w:szCs w:val="24"/>
         </w:rPr>
         <w:t>The</w:t>
       </w:r>
@@ -302,6 +350,8 @@
         <w:rPr>
           <w:rFonts w:asciiTheme="minorHAnsi" w:hAnsiTheme="minorHAnsi"/>
           <w:color w:val="1F497D" w:themeColor="text2"/>
+          <w:sz w:val="24"/>
+          <w:szCs w:val="24"/>
         </w:rPr>
         <w:t xml:space="preserve"> third,</w:t>
       </w:r>
@@ -309,6 +359,8 @@
         <w:rPr>
           <w:rFonts w:asciiTheme="minorHAnsi" w:hAnsiTheme="minorHAnsi"/>
           <w:color w:val="1F497D" w:themeColor="text2"/>
+          <w:sz w:val="24"/>
+          <w:szCs w:val="24"/>
         </w:rPr>
         <w:t xml:space="preserve"> </w:t>
       </w:r>
@@ -318,6 +370,8 @@
           <w:b/>
           <w:bCs/>
           <w:color w:val="1F497D" w:themeColor="text2"/>
+          <w:sz w:val="24"/>
+          <w:szCs w:val="24"/>
         </w:rPr>
         <w:t xml:space="preserve">Radiating Electrons </w:t>
       </w:r>
@@ -325,6 +379,8 @@
         <w:rPr>
           <w:rFonts w:asciiTheme="minorHAnsi" w:hAnsiTheme="minorHAnsi"/>
           <w:color w:val="1F497D" w:themeColor="text2"/>
+          <w:sz w:val="24"/>
+          <w:szCs w:val="24"/>
         </w:rPr>
         <w:t>controls</w:t>
       </w:r>
@@ -334,6 +390,8 @@
           <w:b/>
           <w:bCs/>
           <w:color w:val="1F497D" w:themeColor="text2"/>
+          <w:sz w:val="24"/>
+          <w:szCs w:val="24"/>
         </w:rPr>
         <w:t xml:space="preserve"> </w:t>
       </w:r>
@@ -341,6 +399,8 @@
         <w:rPr>
           <w:rFonts w:asciiTheme="minorHAnsi" w:hAnsiTheme="minorHAnsi"/>
           <w:color w:val="1F497D" w:themeColor="text2"/>
+          <w:sz w:val="24"/>
+          <w:szCs w:val="24"/>
         </w:rPr>
         <w:t>the</w:t>
       </w:r>
@@ -348,6 +408,8 @@
         <w:rPr>
           <w:rFonts w:asciiTheme="minorHAnsi" w:hAnsiTheme="minorHAnsi"/>
           <w:color w:val="1F497D" w:themeColor="text2"/>
+          <w:sz w:val="24"/>
+          <w:szCs w:val="24"/>
         </w:rPr>
         <w:t xml:space="preserve"> properties of the electron population: the</w:t>
       </w:r>
@@ -355,6 +417,8 @@
         <w:rPr>
           <w:rFonts w:asciiTheme="minorHAnsi" w:hAnsiTheme="minorHAnsi"/>
           <w:color w:val="1F497D" w:themeColor="text2"/>
+          <w:sz w:val="24"/>
+          <w:szCs w:val="24"/>
         </w:rPr>
         <w:t xml:space="preserve"> initial temperature</w:t>
       </w:r>
@@ -362,6 +426,8 @@
         <w:rPr>
           <w:rFonts w:asciiTheme="minorHAnsi" w:hAnsiTheme="minorHAnsi"/>
           <w:color w:val="1F497D" w:themeColor="text2"/>
+          <w:sz w:val="24"/>
+          <w:szCs w:val="24"/>
         </w:rPr>
         <w:t>/minimum energy</w:t>
       </w:r>
@@ -369,6 +435,8 @@
         <w:rPr>
           <w:rFonts w:asciiTheme="minorHAnsi" w:hAnsiTheme="minorHAnsi"/>
           <w:color w:val="1F497D" w:themeColor="text2"/>
+          <w:sz w:val="24"/>
+          <w:szCs w:val="24"/>
         </w:rPr>
         <w:t xml:space="preserve">, how fast the electrons cool, and maximum energy of the electrons that produce the emission we see. </w:t>
       </w:r>
@@ -378,6 +446,8 @@
           <w:b/>
           <w:bCs/>
           <w:color w:val="1F497D" w:themeColor="text2"/>
+          <w:sz w:val="24"/>
+          <w:szCs w:val="24"/>
         </w:rPr>
         <w:t xml:space="preserve"> </w:t>
       </w:r>
@@ -387,19 +457,34 @@
         <w:rPr>
           <w:rFonts w:asciiTheme="minorHAnsi" w:hAnsiTheme="minorHAnsi"/>
           <w:color w:val="1F497D" w:themeColor="text2"/>
-        </w:rPr>
-      </w:pPr>
-      <w:r>
-        <w:rPr>
-          <w:rFonts w:asciiTheme="minorHAnsi" w:hAnsiTheme="minorHAnsi"/>
-          <w:color w:val="1F497D" w:themeColor="text2"/>
-        </w:rPr>
-        <w:t xml:space="preserve">Use the explorer to change one parameter at a time. </w:t>
-      </w:r>
-      <w:r>
-        <w:rPr>
-          <w:rFonts w:asciiTheme="minorHAnsi" w:hAnsiTheme="minorHAnsi"/>
-          <w:color w:val="1F497D" w:themeColor="text2"/>
+          <w:sz w:val="24"/>
+          <w:szCs w:val="24"/>
+        </w:rPr>
+      </w:pPr>
+      <w:r>
+        <w:rPr>
+          <w:rFonts w:asciiTheme="minorHAnsi" w:hAnsiTheme="minorHAnsi"/>
+          <w:color w:val="1F497D" w:themeColor="text2"/>
+          <w:sz w:val="24"/>
+          <w:szCs w:val="24"/>
+        </w:rPr>
+        <w:t>Run the second cell and u</w:t>
+      </w:r>
+      <w:r>
+        <w:rPr>
+          <w:rFonts w:asciiTheme="minorHAnsi" w:hAnsiTheme="minorHAnsi"/>
+          <w:color w:val="1F497D" w:themeColor="text2"/>
+          <w:sz w:val="24"/>
+          <w:szCs w:val="24"/>
+        </w:rPr>
+        <w:t xml:space="preserve">se the explorer to change one parameter at a time. </w:t>
+      </w:r>
+      <w:r>
+        <w:rPr>
+          <w:rFonts w:asciiTheme="minorHAnsi" w:hAnsiTheme="minorHAnsi"/>
+          <w:color w:val="1F497D" w:themeColor="text2"/>
+          <w:sz w:val="24"/>
+          <w:szCs w:val="24"/>
         </w:rPr>
         <w:t>We have initially included a few for you to try, starting with a prediction of what impact it will have on the total emission</w:t>
       </w:r>
@@ -407,6 +492,8 @@
         <w:rPr>
           <w:rFonts w:asciiTheme="minorHAnsi" w:hAnsiTheme="minorHAnsi"/>
           <w:color w:val="1F497D" w:themeColor="text2"/>
+          <w:sz w:val="24"/>
+          <w:szCs w:val="24"/>
         </w:rPr>
         <w:t xml:space="preserve"> and some </w:t>
       </w:r>
@@ -414,6 +501,8 @@
         <w:rPr>
           <w:rFonts w:asciiTheme="minorHAnsi" w:hAnsiTheme="minorHAnsi"/>
           <w:color w:val="1F497D" w:themeColor="text2"/>
+          <w:sz w:val="24"/>
+          <w:szCs w:val="24"/>
         </w:rPr>
         <w:t>other related effects.</w:t>
       </w:r>
@@ -421,6 +510,8 @@
         <w:rPr>
           <w:rFonts w:asciiTheme="minorHAnsi" w:hAnsiTheme="minorHAnsi"/>
           <w:color w:val="1F497D" w:themeColor="text2"/>
+          <w:sz w:val="24"/>
+          <w:szCs w:val="24"/>
         </w:rPr>
         <w:t xml:space="preserve"> </w:t>
       </w:r>
@@ -428,6 +519,8 @@
         <w:rPr>
           <w:rFonts w:asciiTheme="minorHAnsi" w:hAnsiTheme="minorHAnsi"/>
           <w:color w:val="1F497D" w:themeColor="text2"/>
+          <w:sz w:val="24"/>
+          <w:szCs w:val="24"/>
         </w:rPr>
         <w:t xml:space="preserve">The left side of the plot </w:t>
       </w:r>
@@ -435,6 +528,8 @@
         <w:rPr>
           <w:rFonts w:asciiTheme="minorHAnsi" w:hAnsiTheme="minorHAnsi"/>
           <w:color w:val="1F497D" w:themeColor="text2"/>
+          <w:sz w:val="24"/>
+          <w:szCs w:val="24"/>
         </w:rPr>
         <w:t>has</w:t>
       </w:r>
@@ -442,6 +537,8 @@
         <w:rPr>
           <w:rFonts w:asciiTheme="minorHAnsi" w:hAnsiTheme="minorHAnsi"/>
           <w:color w:val="1F497D" w:themeColor="text2"/>
+          <w:sz w:val="24"/>
+          <w:szCs w:val="24"/>
         </w:rPr>
         <w:t xml:space="preserve"> small boxes that allow you to move the plot itself around</w:t>
       </w:r>
@@ -449,6 +546,8 @@
         <w:rPr>
           <w:rFonts w:asciiTheme="minorHAnsi" w:hAnsiTheme="minorHAnsi"/>
           <w:color w:val="1F497D" w:themeColor="text2"/>
+          <w:sz w:val="24"/>
+          <w:szCs w:val="24"/>
         </w:rPr>
         <w:t xml:space="preserve"> (e.g. home button resets the plot, the crossed arrows allow you to move the plot around).</w:t>
       </w:r>
@@ -456,8 +555,33 @@
         <w:rPr>
           <w:rFonts w:asciiTheme="minorHAnsi" w:hAnsiTheme="minorHAnsi"/>
           <w:color w:val="1F497D" w:themeColor="text2"/>
+          <w:sz w:val="24"/>
+          <w:szCs w:val="24"/>
         </w:rPr>
         <w:t xml:space="preserve"> </w:t>
+      </w:r>
+    </w:p>
+    <w:p>
+      <w:pPr>
+        <w:rPr>
+          <w:rFonts w:asciiTheme="minorHAnsi" w:hAnsiTheme="minorHAnsi"/>
+          <w:b/>
+          <w:bCs/>
+          <w:color w:val="1F497D" w:themeColor="text2"/>
+          <w:sz w:val="24"/>
+          <w:szCs w:val="24"/>
+        </w:rPr>
+      </w:pPr>
+      <w:r>
+        <w:rPr>
+          <w:rFonts w:asciiTheme="minorHAnsi" w:hAnsiTheme="minorHAnsi"/>
+          <w:b/>
+          <w:bCs/>
+          <w:color w:val="1F497D" w:themeColor="text2"/>
+          <w:sz w:val="24"/>
+          <w:szCs w:val="24"/>
+        </w:rPr>
+        <w:t xml:space="preserve">Source-specific parameters </w:t>
       </w:r>
     </w:p>
     <w:p>
@@ -470,19 +594,34 @@
         <w:rPr>
           <w:rFonts w:asciiTheme="minorHAnsi" w:hAnsiTheme="minorHAnsi"/>
           <w:color w:val="1F497D" w:themeColor="text2"/>
-        </w:rPr>
-      </w:pPr>
-      <w:r>
-        <w:rPr>
-          <w:rFonts w:asciiTheme="minorHAnsi" w:hAnsiTheme="minorHAnsi"/>
-          <w:color w:val="1F497D" w:themeColor="text2"/>
-        </w:rPr>
-        <w:t xml:space="preserve">Start by the changing the black hole mass, even though this is something we usually fix. </w:t>
-      </w:r>
-      <w:r>
-        <w:rPr>
-          <w:rFonts w:asciiTheme="minorHAnsi" w:hAnsiTheme="minorHAnsi"/>
-          <w:color w:val="1F497D" w:themeColor="text2"/>
+          <w:sz w:val="24"/>
+          <w:szCs w:val="24"/>
+        </w:rPr>
+      </w:pPr>
+      <w:r>
+        <w:rPr>
+          <w:rFonts w:asciiTheme="minorHAnsi" w:hAnsiTheme="minorHAnsi"/>
+          <w:color w:val="1F497D" w:themeColor="text2"/>
+          <w:sz w:val="24"/>
+          <w:szCs w:val="24"/>
+        </w:rPr>
+        <w:t>Start by the changing the black hole mass</w:t>
+      </w:r>
+      <w:r>
+        <w:rPr>
+          <w:rFonts w:asciiTheme="minorHAnsi" w:hAnsiTheme="minorHAnsi"/>
+          <w:color w:val="1F497D" w:themeColor="text2"/>
+          <w:sz w:val="24"/>
+          <w:szCs w:val="24"/>
+        </w:rPr>
+        <w:t xml:space="preserve"> </w:t>
+      </w:r>
+      <w:r>
+        <w:rPr>
+          <w:rFonts w:asciiTheme="minorHAnsi" w:hAnsiTheme="minorHAnsi"/>
+          <w:color w:val="1F497D" w:themeColor="text2"/>
+          <w:sz w:val="24"/>
+          <w:szCs w:val="24"/>
         </w:rPr>
         <w:t>(</w:t>
       </w:r>
@@ -493,6 +632,8 @@
           <w:b/>
           <w:bCs/>
           <w:color w:val="1F497D" w:themeColor="text2"/>
+          <w:sz w:val="24"/>
+          <w:szCs w:val="24"/>
         </w:rPr>
         <w:t>mass_bh</w:t>
       </w:r>
@@ -501,8 +642,46 @@
         <w:rPr>
           <w:rFonts w:asciiTheme="minorHAnsi" w:hAnsiTheme="minorHAnsi"/>
           <w:color w:val="1F497D" w:themeColor="text2"/>
+          <w:sz w:val="24"/>
+          <w:szCs w:val="24"/>
         </w:rPr>
         <w:t>)</w:t>
+      </w:r>
+      <w:r>
+        <w:rPr>
+          <w:rFonts w:asciiTheme="minorHAnsi" w:hAnsiTheme="minorHAnsi"/>
+          <w:color w:val="1F497D" w:themeColor="text2"/>
+          <w:sz w:val="24"/>
+          <w:szCs w:val="24"/>
+        </w:rPr>
+        <w:t>, even though this is something we usually fix</w:t>
+      </w:r>
+      <w:r>
+        <w:rPr>
+          <w:rFonts w:asciiTheme="minorHAnsi" w:hAnsiTheme="minorHAnsi"/>
+          <w:color w:val="1F497D" w:themeColor="text2"/>
+          <w:sz w:val="24"/>
+          <w:szCs w:val="24"/>
+        </w:rPr>
+        <w:t xml:space="preserve">. </w:t>
+      </w:r>
+      <w:r>
+        <w:rPr>
+          <w:rFonts w:asciiTheme="minorHAnsi" w:hAnsiTheme="minorHAnsi"/>
+          <w:color w:val="1F497D" w:themeColor="text2"/>
+          <w:sz w:val="24"/>
+          <w:szCs w:val="24"/>
+        </w:rPr>
+        <w:t>Would</w:t>
+      </w:r>
+      <w:r>
+        <w:rPr>
+          <w:rFonts w:asciiTheme="minorHAnsi" w:hAnsiTheme="minorHAnsi"/>
+          <w:color w:val="1F497D" w:themeColor="text2"/>
+          <w:sz w:val="24"/>
+          <w:szCs w:val="24"/>
+        </w:rPr>
+        <w:t xml:space="preserve"> you expect this to have some effect on the total emission? </w:t>
       </w:r>
     </w:p>
     <w:p>
@@ -515,12 +694,16 @@
         <w:rPr>
           <w:rFonts w:asciiTheme="minorHAnsi" w:hAnsiTheme="minorHAnsi"/>
           <w:color w:val="1F497D" w:themeColor="text2"/>
-        </w:rPr>
-      </w:pPr>
-      <w:r>
-        <w:rPr>
-          <w:rFonts w:asciiTheme="minorHAnsi" w:hAnsiTheme="minorHAnsi"/>
-          <w:color w:val="1F497D" w:themeColor="text2"/>
+          <w:sz w:val="24"/>
+          <w:szCs w:val="24"/>
+        </w:rPr>
+      </w:pPr>
+      <w:r>
+        <w:rPr>
+          <w:rFonts w:asciiTheme="minorHAnsi" w:hAnsiTheme="minorHAnsi"/>
+          <w:color w:val="1F497D" w:themeColor="text2"/>
+          <w:sz w:val="24"/>
+          <w:szCs w:val="24"/>
         </w:rPr>
         <w:t xml:space="preserve">Prediction: </w:t>
       </w:r>
@@ -535,15 +718,31 @@
         <w:rPr>
           <w:rFonts w:asciiTheme="minorHAnsi" w:hAnsiTheme="minorHAnsi"/>
           <w:color w:val="1F497D" w:themeColor="text2"/>
-        </w:rPr>
-      </w:pPr>
-      <w:r>
-        <w:rPr>
-          <w:rFonts w:asciiTheme="minorHAnsi" w:hAnsiTheme="minorHAnsi"/>
-          <w:color w:val="1F497D" w:themeColor="text2"/>
+          <w:sz w:val="24"/>
+          <w:szCs w:val="24"/>
+        </w:rPr>
+      </w:pPr>
+      <w:r>
+        <w:rPr>
+          <w:rFonts w:asciiTheme="minorHAnsi" w:hAnsiTheme="minorHAnsi"/>
+          <w:color w:val="1F497D" w:themeColor="text2"/>
+          <w:sz w:val="24"/>
+          <w:szCs w:val="24"/>
         </w:rPr>
         <w:t xml:space="preserve">Result: </w:t>
       </w:r>
+    </w:p>
+    <w:p>
+      <w:pPr>
+        <w:pStyle w:val="ListParagraph"/>
+        <w:ind w:left="1440"/>
+        <w:rPr>
+          <w:rFonts w:asciiTheme="minorHAnsi" w:hAnsiTheme="minorHAnsi"/>
+          <w:color w:val="1F497D" w:themeColor="text2"/>
+          <w:sz w:val="24"/>
+          <w:szCs w:val="24"/>
+        </w:rPr>
+      </w:pPr>
     </w:p>
     <w:p>
       <w:pPr>
@@ -555,12 +754,16 @@
         <w:rPr>
           <w:rFonts w:asciiTheme="minorHAnsi" w:hAnsiTheme="minorHAnsi"/>
           <w:color w:val="1F497D" w:themeColor="text2"/>
-        </w:rPr>
-      </w:pPr>
-      <w:r>
-        <w:rPr>
-          <w:rFonts w:asciiTheme="minorHAnsi" w:hAnsiTheme="minorHAnsi"/>
-          <w:color w:val="1F497D" w:themeColor="text2"/>
+          <w:sz w:val="24"/>
+          <w:szCs w:val="24"/>
+        </w:rPr>
+      </w:pPr>
+      <w:r>
+        <w:rPr>
+          <w:rFonts w:asciiTheme="minorHAnsi" w:hAnsiTheme="minorHAnsi"/>
+          <w:color w:val="1F497D" w:themeColor="text2"/>
+          <w:sz w:val="24"/>
+          <w:szCs w:val="24"/>
         </w:rPr>
         <w:t xml:space="preserve">Make the viewing angle </w:t>
       </w:r>
@@ -570,6 +773,8 @@
           <w:b/>
           <w:bCs/>
           <w:color w:val="1F497D" w:themeColor="text2"/>
+          <w:sz w:val="24"/>
+          <w:szCs w:val="24"/>
         </w:rPr>
         <w:t>(</w:t>
       </w:r>
@@ -580,6 +785,8 @@
           <w:b/>
           <w:bCs/>
           <w:color w:val="1F497D" w:themeColor="text2"/>
+          <w:sz w:val="24"/>
+          <w:szCs w:val="24"/>
         </w:rPr>
         <w:t>theta_obs</w:t>
       </w:r>
@@ -590,6 +797,8 @@
           <w:b/>
           <w:bCs/>
           <w:color w:val="1F497D" w:themeColor="text2"/>
+          <w:sz w:val="24"/>
+          <w:szCs w:val="24"/>
         </w:rPr>
         <w:t>)</w:t>
       </w:r>
@@ -597,6 +806,8 @@
         <w:rPr>
           <w:rFonts w:asciiTheme="minorHAnsi" w:hAnsiTheme="minorHAnsi"/>
           <w:color w:val="1F497D" w:themeColor="text2"/>
+          <w:sz w:val="24"/>
+          <w:szCs w:val="24"/>
         </w:rPr>
         <w:t xml:space="preserve"> smaller. What is happening to the jet as the angle between where it points and our telescopes becomes smaller, and what does this do to the emission we see?  </w:t>
       </w:r>
@@ -611,12 +822,16 @@
         <w:rPr>
           <w:rFonts w:asciiTheme="minorHAnsi" w:hAnsiTheme="minorHAnsi"/>
           <w:color w:val="1F497D" w:themeColor="text2"/>
-        </w:rPr>
-      </w:pPr>
-      <w:r>
-        <w:rPr>
-          <w:rFonts w:asciiTheme="minorHAnsi" w:hAnsiTheme="minorHAnsi"/>
-          <w:color w:val="1F497D" w:themeColor="text2"/>
+          <w:sz w:val="24"/>
+          <w:szCs w:val="24"/>
+        </w:rPr>
+      </w:pPr>
+      <w:r>
+        <w:rPr>
+          <w:rFonts w:asciiTheme="minorHAnsi" w:hAnsiTheme="minorHAnsi"/>
+          <w:color w:val="1F497D" w:themeColor="text2"/>
+          <w:sz w:val="24"/>
+          <w:szCs w:val="24"/>
         </w:rPr>
         <w:t xml:space="preserve">Prediction: </w:t>
       </w:r>
@@ -631,14 +846,61 @@
         <w:rPr>
           <w:rFonts w:asciiTheme="minorHAnsi" w:hAnsiTheme="minorHAnsi"/>
           <w:color w:val="1F497D" w:themeColor="text2"/>
-        </w:rPr>
-      </w:pPr>
-      <w:r>
-        <w:rPr>
-          <w:rFonts w:asciiTheme="minorHAnsi" w:hAnsiTheme="minorHAnsi"/>
-          <w:color w:val="1F497D" w:themeColor="text2"/>
+          <w:sz w:val="24"/>
+          <w:szCs w:val="24"/>
+        </w:rPr>
+      </w:pPr>
+      <w:r>
+        <w:rPr>
+          <w:rFonts w:asciiTheme="minorHAnsi" w:hAnsiTheme="minorHAnsi"/>
+          <w:color w:val="1F497D" w:themeColor="text2"/>
+          <w:sz w:val="24"/>
+          <w:szCs w:val="24"/>
         </w:rPr>
         <w:t>Result</w:t>
+      </w:r>
+    </w:p>
+    <w:p>
+      <w:pPr>
+        <w:rPr>
+          <w:rFonts w:asciiTheme="minorHAnsi" w:hAnsiTheme="minorHAnsi"/>
+          <w:color w:val="1F497D" w:themeColor="text2"/>
+          <w:sz w:val="24"/>
+          <w:szCs w:val="24"/>
+        </w:rPr>
+      </w:pPr>
+    </w:p>
+    <w:p>
+      <w:pPr>
+        <w:rPr>
+          <w:rFonts w:asciiTheme="minorHAnsi" w:hAnsiTheme="minorHAnsi"/>
+          <w:color w:val="1F497D" w:themeColor="text2"/>
+          <w:sz w:val="24"/>
+          <w:szCs w:val="24"/>
+        </w:rPr>
+      </w:pPr>
+    </w:p>
+    <w:p>
+      <w:pPr>
+        <w:rPr>
+          <w:rFonts w:asciiTheme="minorHAnsi" w:hAnsiTheme="minorHAnsi"/>
+          <w:b/>
+          <w:bCs/>
+          <w:color w:val="1F497D" w:themeColor="text2"/>
+          <w:sz w:val="24"/>
+          <w:szCs w:val="24"/>
+        </w:rPr>
+      </w:pPr>
+      <w:r>
+        <w:rPr>
+          <w:rFonts w:asciiTheme="minorHAnsi" w:hAnsiTheme="minorHAnsi"/>
+          <w:b/>
+          <w:bCs/>
+          <w:color w:val="1F497D" w:themeColor="text2"/>
+          <w:sz w:val="24"/>
+          <w:szCs w:val="24"/>
+        </w:rPr>
+        <w:t>Jet Properties</w:t>
       </w:r>
     </w:p>
     <w:p>
@@ -651,12 +913,16 @@
         <w:rPr>
           <w:rFonts w:asciiTheme="minorHAnsi" w:hAnsiTheme="minorHAnsi"/>
           <w:color w:val="1F497D" w:themeColor="text2"/>
-        </w:rPr>
-      </w:pPr>
-      <w:r>
-        <w:rPr>
-          <w:rFonts w:asciiTheme="minorHAnsi" w:hAnsiTheme="minorHAnsi"/>
-          <w:color w:val="1F497D" w:themeColor="text2"/>
+          <w:sz w:val="24"/>
+          <w:szCs w:val="24"/>
+        </w:rPr>
+      </w:pPr>
+      <w:r>
+        <w:rPr>
+          <w:rFonts w:asciiTheme="minorHAnsi" w:hAnsiTheme="minorHAnsi"/>
+          <w:color w:val="1F497D" w:themeColor="text2"/>
+          <w:sz w:val="24"/>
+          <w:szCs w:val="24"/>
         </w:rPr>
         <w:t>What does the total j</w:t>
       </w:r>
@@ -664,6 +930,8 @@
         <w:rPr>
           <w:rFonts w:asciiTheme="minorHAnsi" w:hAnsiTheme="minorHAnsi"/>
           <w:color w:val="1F497D" w:themeColor="text2"/>
+          <w:sz w:val="24"/>
+          <w:szCs w:val="24"/>
         </w:rPr>
         <w:t>et power</w:t>
       </w:r>
@@ -671,6 +939,8 @@
         <w:rPr>
           <w:rFonts w:asciiTheme="minorHAnsi" w:hAnsiTheme="minorHAnsi"/>
           <w:color w:val="1F497D" w:themeColor="text2"/>
+          <w:sz w:val="24"/>
+          <w:szCs w:val="24"/>
         </w:rPr>
         <w:t xml:space="preserve"> (</w:t>
       </w:r>
@@ -681,6 +951,8 @@
           <w:b/>
           <w:bCs/>
           <w:color w:val="1F497D" w:themeColor="text2"/>
+          <w:sz w:val="24"/>
+          <w:szCs w:val="24"/>
         </w:rPr>
         <w:t>jet_power_eddington</w:t>
       </w:r>
@@ -691,6 +963,8 @@
           <w:b/>
           <w:bCs/>
           <w:color w:val="1F497D" w:themeColor="text2"/>
+          <w:sz w:val="24"/>
+          <w:szCs w:val="24"/>
         </w:rPr>
         <w:t>)</w:t>
       </w:r>
@@ -698,6 +972,8 @@
         <w:rPr>
           <w:rFonts w:asciiTheme="minorHAnsi" w:hAnsiTheme="minorHAnsi"/>
           <w:color w:val="1F497D" w:themeColor="text2"/>
+          <w:sz w:val="24"/>
+          <w:szCs w:val="24"/>
         </w:rPr>
         <w:t xml:space="preserve"> do to the emission?</w:t>
       </w:r>
@@ -712,12 +988,16 @@
         <w:rPr>
           <w:rFonts w:asciiTheme="minorHAnsi" w:hAnsiTheme="minorHAnsi"/>
           <w:color w:val="1F497D" w:themeColor="text2"/>
-        </w:rPr>
-      </w:pPr>
-      <w:r>
-        <w:rPr>
-          <w:rFonts w:asciiTheme="minorHAnsi" w:hAnsiTheme="minorHAnsi"/>
-          <w:color w:val="1F497D" w:themeColor="text2"/>
+          <w:sz w:val="24"/>
+          <w:szCs w:val="24"/>
+        </w:rPr>
+      </w:pPr>
+      <w:r>
+        <w:rPr>
+          <w:rFonts w:asciiTheme="minorHAnsi" w:hAnsiTheme="minorHAnsi"/>
+          <w:color w:val="1F497D" w:themeColor="text2"/>
+          <w:sz w:val="24"/>
+          <w:szCs w:val="24"/>
         </w:rPr>
         <w:t xml:space="preserve">Prediction: </w:t>
       </w:r>
@@ -732,15 +1012,31 @@
         <w:rPr>
           <w:rFonts w:asciiTheme="minorHAnsi" w:hAnsiTheme="minorHAnsi"/>
           <w:color w:val="1F497D" w:themeColor="text2"/>
-        </w:rPr>
-      </w:pPr>
-      <w:r>
-        <w:rPr>
-          <w:rFonts w:asciiTheme="minorHAnsi" w:hAnsiTheme="minorHAnsi"/>
-          <w:color w:val="1F497D" w:themeColor="text2"/>
+          <w:sz w:val="24"/>
+          <w:szCs w:val="24"/>
+        </w:rPr>
+      </w:pPr>
+      <w:r>
+        <w:rPr>
+          <w:rFonts w:asciiTheme="minorHAnsi" w:hAnsiTheme="minorHAnsi"/>
+          <w:color w:val="1F497D" w:themeColor="text2"/>
+          <w:sz w:val="24"/>
+          <w:szCs w:val="24"/>
         </w:rPr>
         <w:t xml:space="preserve">Result: </w:t>
       </w:r>
+    </w:p>
+    <w:p>
+      <w:pPr>
+        <w:pStyle w:val="ListParagraph"/>
+        <w:ind w:left="1440"/>
+        <w:rPr>
+          <w:rFonts w:asciiTheme="minorHAnsi" w:hAnsiTheme="minorHAnsi"/>
+          <w:color w:val="1F497D" w:themeColor="text2"/>
+          <w:sz w:val="24"/>
+          <w:szCs w:val="24"/>
+        </w:rPr>
+      </w:pPr>
     </w:p>
     <w:p>
       <w:pPr>
@@ -752,21 +1048,18 @@
         <w:rPr>
           <w:rFonts w:asciiTheme="minorHAnsi" w:hAnsiTheme="minorHAnsi"/>
           <w:color w:val="1F497D" w:themeColor="text2"/>
-        </w:rPr>
-      </w:pPr>
-      <w:r>
-        <w:rPr>
-          <w:rFonts w:asciiTheme="minorHAnsi" w:hAnsiTheme="minorHAnsi"/>
-          <w:color w:val="1F497D" w:themeColor="text2"/>
-        </w:rPr>
-        <w:t xml:space="preserve">What happens if you change </w:t>
-      </w:r>
-      <w:r>
-        <w:rPr>
-          <w:rFonts w:asciiTheme="minorHAnsi" w:hAnsiTheme="minorHAnsi"/>
-          <w:color w:val="1F497D" w:themeColor="text2"/>
-        </w:rPr>
-        <w:t>(</w:t>
+          <w:sz w:val="24"/>
+          <w:szCs w:val="24"/>
+        </w:rPr>
+      </w:pPr>
+      <w:r>
+        <w:rPr>
+          <w:rFonts w:asciiTheme="minorHAnsi" w:hAnsiTheme="minorHAnsi"/>
+          <w:color w:val="1F497D" w:themeColor="text2"/>
+          <w:sz w:val="24"/>
+          <w:szCs w:val="24"/>
+        </w:rPr>
+        <w:t>What happens if you change (</w:t>
       </w:r>
       <w:proofErr w:type="spellStart"/>
       <w:r>
@@ -775,6 +1068,8 @@
           <w:b/>
           <w:bCs/>
           <w:color w:val="1F497D" w:themeColor="text2"/>
+          <w:sz w:val="24"/>
+          <w:szCs w:val="24"/>
         </w:rPr>
         <w:t>r_initial</w:t>
       </w:r>
@@ -785,6 +1080,8 @@
           <w:b/>
           <w:bCs/>
           <w:color w:val="1F497D" w:themeColor="text2"/>
+          <w:sz w:val="24"/>
+          <w:szCs w:val="24"/>
         </w:rPr>
         <w:t xml:space="preserve">) </w:t>
       </w:r>
@@ -792,6 +1089,8 @@
         <w:rPr>
           <w:rFonts w:asciiTheme="minorHAnsi" w:hAnsiTheme="minorHAnsi"/>
           <w:color w:val="1F497D" w:themeColor="text2"/>
+          <w:sz w:val="24"/>
+          <w:szCs w:val="24"/>
         </w:rPr>
         <w:t xml:space="preserve">while leaving the jet power at the same value? </w:t>
       </w:r>
@@ -799,8 +1098,19 @@
         <w:rPr>
           <w:rFonts w:asciiTheme="minorHAnsi" w:hAnsiTheme="minorHAnsi"/>
           <w:color w:val="1F497D" w:themeColor="text2"/>
-        </w:rPr>
-        <w:t xml:space="preserve">Think about what is happening at the base of the jet. </w:t>
+          <w:sz w:val="24"/>
+          <w:szCs w:val="24"/>
+        </w:rPr>
+        <w:t>Think about what is happening at the base of the jet</w:t>
+      </w:r>
+      <w:r>
+        <w:rPr>
+          <w:rFonts w:asciiTheme="minorHAnsi" w:hAnsiTheme="minorHAnsi"/>
+          <w:color w:val="1F497D" w:themeColor="text2"/>
+          <w:sz w:val="24"/>
+          <w:szCs w:val="24"/>
+        </w:rPr>
+        <w:t xml:space="preserve">. </w:t>
       </w:r>
     </w:p>
     <w:p>
@@ -813,12 +1123,16 @@
         <w:rPr>
           <w:rFonts w:asciiTheme="minorHAnsi" w:hAnsiTheme="minorHAnsi"/>
           <w:color w:val="1F497D" w:themeColor="text2"/>
-        </w:rPr>
-      </w:pPr>
-      <w:r>
-        <w:rPr>
-          <w:rFonts w:asciiTheme="minorHAnsi" w:hAnsiTheme="minorHAnsi"/>
-          <w:color w:val="1F497D" w:themeColor="text2"/>
+          <w:sz w:val="24"/>
+          <w:szCs w:val="24"/>
+        </w:rPr>
+      </w:pPr>
+      <w:r>
+        <w:rPr>
+          <w:rFonts w:asciiTheme="minorHAnsi" w:hAnsiTheme="minorHAnsi"/>
+          <w:color w:val="1F497D" w:themeColor="text2"/>
+          <w:sz w:val="24"/>
+          <w:szCs w:val="24"/>
         </w:rPr>
         <w:t>Prediction:</w:t>
       </w:r>
@@ -833,12 +1147,16 @@
         <w:rPr>
           <w:rFonts w:asciiTheme="minorHAnsi" w:hAnsiTheme="minorHAnsi"/>
           <w:color w:val="1F497D" w:themeColor="text2"/>
-        </w:rPr>
-      </w:pPr>
-      <w:r>
-        <w:rPr>
-          <w:rFonts w:asciiTheme="minorHAnsi" w:hAnsiTheme="minorHAnsi"/>
-          <w:color w:val="1F497D" w:themeColor="text2"/>
+          <w:sz w:val="24"/>
+          <w:szCs w:val="24"/>
+        </w:rPr>
+      </w:pPr>
+      <w:r>
+        <w:rPr>
+          <w:rFonts w:asciiTheme="minorHAnsi" w:hAnsiTheme="minorHAnsi"/>
+          <w:color w:val="1F497D" w:themeColor="text2"/>
+          <w:sz w:val="24"/>
+          <w:szCs w:val="24"/>
         </w:rPr>
         <w:t xml:space="preserve">Result: </w:t>
       </w:r>
@@ -848,8 +1166,33 @@
         <w:rPr>
           <w:rFonts w:asciiTheme="minorHAnsi" w:hAnsiTheme="minorHAnsi"/>
           <w:color w:val="1F497D" w:themeColor="text2"/>
-        </w:rPr>
-      </w:pPr>
+          <w:sz w:val="24"/>
+          <w:szCs w:val="24"/>
+        </w:rPr>
+      </w:pPr>
+    </w:p>
+    <w:p>
+      <w:pPr>
+        <w:rPr>
+          <w:rFonts w:asciiTheme="minorHAnsi" w:hAnsiTheme="minorHAnsi"/>
+          <w:b/>
+          <w:bCs/>
+          <w:color w:val="1F497D" w:themeColor="text2"/>
+          <w:sz w:val="24"/>
+          <w:szCs w:val="24"/>
+        </w:rPr>
+      </w:pPr>
+      <w:r>
+        <w:rPr>
+          <w:rFonts w:asciiTheme="minorHAnsi" w:hAnsiTheme="minorHAnsi"/>
+          <w:b/>
+          <w:bCs/>
+          <w:color w:val="1F497D" w:themeColor="text2"/>
+          <w:sz w:val="24"/>
+          <w:szCs w:val="24"/>
+        </w:rPr>
+        <w:t>Electron Distribution</w:t>
+      </w:r>
     </w:p>
     <w:p>
       <w:pPr>
@@ -861,12 +1204,16 @@
         <w:rPr>
           <w:rFonts w:asciiTheme="minorHAnsi" w:hAnsiTheme="minorHAnsi"/>
           <w:color w:val="1F497D" w:themeColor="text2"/>
-        </w:rPr>
-      </w:pPr>
-      <w:r>
-        <w:rPr>
-          <w:rFonts w:asciiTheme="minorHAnsi" w:hAnsiTheme="minorHAnsi"/>
-          <w:color w:val="1F497D" w:themeColor="text2"/>
+          <w:sz w:val="24"/>
+          <w:szCs w:val="24"/>
+        </w:rPr>
+      </w:pPr>
+      <w:r>
+        <w:rPr>
+          <w:rFonts w:asciiTheme="minorHAnsi" w:hAnsiTheme="minorHAnsi"/>
+          <w:color w:val="1F497D" w:themeColor="text2"/>
+          <w:sz w:val="24"/>
+          <w:szCs w:val="24"/>
         </w:rPr>
         <w:t>What happens to the post-acceleration synchrotron radiation (</w:t>
       </w:r>
@@ -876,6 +1223,8 @@
           <w:b/>
           <w:bCs/>
           <w:color w:val="1F497D" w:themeColor="text2"/>
+          <w:sz w:val="24"/>
+          <w:szCs w:val="24"/>
         </w:rPr>
         <w:t>dashed orange line</w:t>
       </w:r>
@@ -883,6 +1232,8 @@
         <w:rPr>
           <w:rFonts w:asciiTheme="minorHAnsi" w:hAnsiTheme="minorHAnsi"/>
           <w:color w:val="1F497D" w:themeColor="text2"/>
+          <w:sz w:val="24"/>
+          <w:szCs w:val="24"/>
         </w:rPr>
         <w:t>) when you move the e</w:t>
       </w:r>
@@ -890,6 +1241,8 @@
         <w:rPr>
           <w:rFonts w:asciiTheme="minorHAnsi" w:hAnsiTheme="minorHAnsi"/>
           <w:color w:val="1F497D" w:themeColor="text2"/>
+          <w:sz w:val="24"/>
+          <w:szCs w:val="24"/>
         </w:rPr>
         <w:t xml:space="preserve">lectron </w:t>
       </w:r>
@@ -897,6 +1250,8 @@
         <w:rPr>
           <w:rFonts w:asciiTheme="minorHAnsi" w:hAnsiTheme="minorHAnsi"/>
           <w:color w:val="1F497D" w:themeColor="text2"/>
+          <w:sz w:val="24"/>
+          <w:szCs w:val="24"/>
         </w:rPr>
         <w:t>m</w:t>
       </w:r>
@@ -904,6 +1259,8 @@
         <w:rPr>
           <w:rFonts w:asciiTheme="minorHAnsi" w:hAnsiTheme="minorHAnsi"/>
           <w:color w:val="1F497D" w:themeColor="text2"/>
+          <w:sz w:val="24"/>
+          <w:szCs w:val="24"/>
         </w:rPr>
         <w:t xml:space="preserve">aximum </w:t>
       </w:r>
@@ -911,6 +1268,8 @@
         <w:rPr>
           <w:rFonts w:asciiTheme="minorHAnsi" w:hAnsiTheme="minorHAnsi"/>
           <w:color w:val="1F497D" w:themeColor="text2"/>
+          <w:sz w:val="24"/>
+          <w:szCs w:val="24"/>
         </w:rPr>
         <w:t>e</w:t>
       </w:r>
@@ -918,6 +1277,8 @@
         <w:rPr>
           <w:rFonts w:asciiTheme="minorHAnsi" w:hAnsiTheme="minorHAnsi"/>
           <w:color w:val="1F497D" w:themeColor="text2"/>
+          <w:sz w:val="24"/>
+          <w:szCs w:val="24"/>
         </w:rPr>
         <w:t>nergy</w:t>
       </w:r>
@@ -925,6 +1286,8 @@
         <w:rPr>
           <w:rFonts w:asciiTheme="minorHAnsi" w:hAnsiTheme="minorHAnsi"/>
           <w:color w:val="1F497D" w:themeColor="text2"/>
+          <w:sz w:val="24"/>
+          <w:szCs w:val="24"/>
         </w:rPr>
         <w:t xml:space="preserve"> (</w:t>
       </w:r>
@@ -935,6 +1298,8 @@
           <w:b/>
           <w:bCs/>
           <w:color w:val="1F497D" w:themeColor="text2"/>
+          <w:sz w:val="24"/>
+          <w:szCs w:val="24"/>
         </w:rPr>
         <w:t>factor_max_energy_electrons</w:t>
       </w:r>
@@ -943,6 +1308,8 @@
         <w:rPr>
           <w:rFonts w:asciiTheme="minorHAnsi" w:hAnsiTheme="minorHAnsi"/>
           <w:color w:val="1F497D" w:themeColor="text2"/>
+          <w:sz w:val="24"/>
+          <w:szCs w:val="24"/>
         </w:rPr>
         <w:t>)</w:t>
       </w:r>
@@ -950,6 +1317,8 @@
         <w:rPr>
           <w:rFonts w:asciiTheme="minorHAnsi" w:hAnsiTheme="minorHAnsi"/>
           <w:color w:val="1F497D" w:themeColor="text2"/>
+          <w:sz w:val="24"/>
+          <w:szCs w:val="24"/>
         </w:rPr>
         <w:t xml:space="preserve"> to smaller or </w:t>
       </w:r>
@@ -957,6 +1326,8 @@
         <w:rPr>
           <w:rFonts w:asciiTheme="minorHAnsi" w:hAnsiTheme="minorHAnsi"/>
           <w:color w:val="1F497D" w:themeColor="text2"/>
+          <w:sz w:val="24"/>
+          <w:szCs w:val="24"/>
         </w:rPr>
         <w:t>larger</w:t>
       </w:r>
@@ -964,6 +1335,8 @@
         <w:rPr>
           <w:rFonts w:asciiTheme="minorHAnsi" w:hAnsiTheme="minorHAnsi"/>
           <w:color w:val="1F497D" w:themeColor="text2"/>
+          <w:sz w:val="24"/>
+          <w:szCs w:val="24"/>
         </w:rPr>
         <w:t xml:space="preserve"> values? </w:t>
       </w:r>
@@ -978,12 +1351,16 @@
         <w:rPr>
           <w:rFonts w:asciiTheme="minorHAnsi" w:hAnsiTheme="minorHAnsi"/>
           <w:color w:val="1F497D" w:themeColor="text2"/>
-        </w:rPr>
-      </w:pPr>
-      <w:r>
-        <w:rPr>
-          <w:rFonts w:asciiTheme="minorHAnsi" w:hAnsiTheme="minorHAnsi"/>
-          <w:color w:val="1F497D" w:themeColor="text2"/>
+          <w:sz w:val="24"/>
+          <w:szCs w:val="24"/>
+        </w:rPr>
+      </w:pPr>
+      <w:r>
+        <w:rPr>
+          <w:rFonts w:asciiTheme="minorHAnsi" w:hAnsiTheme="minorHAnsi"/>
+          <w:color w:val="1F497D" w:themeColor="text2"/>
+          <w:sz w:val="24"/>
+          <w:szCs w:val="24"/>
         </w:rPr>
         <w:t xml:space="preserve">Prediction: </w:t>
       </w:r>
@@ -998,12 +1375,16 @@
         <w:rPr>
           <w:rFonts w:asciiTheme="minorHAnsi" w:hAnsiTheme="minorHAnsi"/>
           <w:color w:val="1F497D" w:themeColor="text2"/>
-        </w:rPr>
-      </w:pPr>
-      <w:r>
-        <w:rPr>
-          <w:rFonts w:asciiTheme="minorHAnsi" w:hAnsiTheme="minorHAnsi"/>
-          <w:color w:val="1F497D" w:themeColor="text2"/>
+          <w:sz w:val="24"/>
+          <w:szCs w:val="24"/>
+        </w:rPr>
+      </w:pPr>
+      <w:r>
+        <w:rPr>
+          <w:rFonts w:asciiTheme="minorHAnsi" w:hAnsiTheme="minorHAnsi"/>
+          <w:color w:val="1F497D" w:themeColor="text2"/>
+          <w:sz w:val="24"/>
+          <w:szCs w:val="24"/>
         </w:rPr>
         <w:t xml:space="preserve">Result: </w:t>
       </w:r>
@@ -1018,12 +1399,16 @@
         <w:rPr>
           <w:rFonts w:asciiTheme="minorHAnsi" w:hAnsiTheme="minorHAnsi"/>
           <w:color w:val="1F497D" w:themeColor="text2"/>
-        </w:rPr>
-      </w:pPr>
-      <w:r>
-        <w:rPr>
-          <w:rFonts w:asciiTheme="minorHAnsi" w:hAnsiTheme="minorHAnsi"/>
-          <w:color w:val="1F497D" w:themeColor="text2"/>
+          <w:sz w:val="24"/>
+          <w:szCs w:val="24"/>
+        </w:rPr>
+      </w:pPr>
+      <w:r>
+        <w:rPr>
+          <w:rFonts w:asciiTheme="minorHAnsi" w:hAnsiTheme="minorHAnsi"/>
+          <w:color w:val="1F497D" w:themeColor="text2"/>
+          <w:sz w:val="24"/>
+          <w:szCs w:val="24"/>
         </w:rPr>
         <w:t>What does the electron maximum energy have to do with the inverse Compton emission (</w:t>
       </w:r>
@@ -1033,6 +1418,8 @@
           <w:b/>
           <w:bCs/>
           <w:color w:val="1F497D" w:themeColor="text2"/>
+          <w:sz w:val="24"/>
+          <w:szCs w:val="24"/>
         </w:rPr>
         <w:t>dashed red line</w:t>
       </w:r>
@@ -1040,15 +1427,10 @@
         <w:rPr>
           <w:rFonts w:asciiTheme="minorHAnsi" w:hAnsiTheme="minorHAnsi"/>
           <w:color w:val="1F497D" w:themeColor="text2"/>
-        </w:rPr>
-        <w:t>)</w:t>
-      </w:r>
-      <w:r>
-        <w:rPr>
-          <w:rFonts w:asciiTheme="minorHAnsi" w:hAnsiTheme="minorHAnsi"/>
-          <w:color w:val="1F497D" w:themeColor="text2"/>
-        </w:rPr>
-        <w:t>?</w:t>
+          <w:sz w:val="24"/>
+          <w:szCs w:val="24"/>
+        </w:rPr>
+        <w:t>)?</w:t>
       </w:r>
     </w:p>
     <w:p>
@@ -1058,6 +1440,8 @@
         <w:rPr>
           <w:rFonts w:asciiTheme="minorHAnsi" w:hAnsiTheme="minorHAnsi"/>
           <w:color w:val="1F497D" w:themeColor="text2"/>
+          <w:sz w:val="24"/>
+          <w:szCs w:val="24"/>
         </w:rPr>
       </w:pPr>
     </w:p>
@@ -1071,12 +1455,16 @@
         <w:rPr>
           <w:rFonts w:asciiTheme="minorHAnsi" w:hAnsiTheme="minorHAnsi"/>
           <w:color w:val="1F497D" w:themeColor="text2"/>
-        </w:rPr>
-      </w:pPr>
-      <w:r>
-        <w:rPr>
-          <w:rFonts w:asciiTheme="minorHAnsi" w:hAnsiTheme="minorHAnsi"/>
-          <w:color w:val="1F497D" w:themeColor="text2"/>
+          <w:sz w:val="24"/>
+          <w:szCs w:val="24"/>
+        </w:rPr>
+      </w:pPr>
+      <w:r>
+        <w:rPr>
+          <w:rFonts w:asciiTheme="minorHAnsi" w:hAnsiTheme="minorHAnsi"/>
+          <w:color w:val="1F497D" w:themeColor="text2"/>
+          <w:sz w:val="24"/>
+          <w:szCs w:val="24"/>
         </w:rPr>
         <w:t xml:space="preserve">Change the temperature of the thermal </w:t>
       </w:r>
@@ -1084,6 +1472,8 @@
         <w:rPr>
           <w:rFonts w:asciiTheme="minorHAnsi" w:hAnsiTheme="minorHAnsi"/>
           <w:color w:val="1F497D" w:themeColor="text2"/>
+          <w:sz w:val="24"/>
+          <w:szCs w:val="24"/>
         </w:rPr>
         <w:t xml:space="preserve">(non-accelerated) </w:t>
       </w:r>
@@ -1091,6 +1481,8 @@
         <w:rPr>
           <w:rFonts w:asciiTheme="minorHAnsi" w:hAnsiTheme="minorHAnsi"/>
           <w:color w:val="1F497D" w:themeColor="text2"/>
+          <w:sz w:val="24"/>
+          <w:szCs w:val="24"/>
         </w:rPr>
         <w:t>electrons at the jet base (</w:t>
       </w:r>
@@ -1102,8 +1494,8 @@
           <w:b/>
           <w:bCs/>
           <w:color w:val="1F497D" w:themeColor="text2"/>
-          <w:sz w:val="22"/>
-          <w:szCs w:val="22"/>
+          <w:sz w:val="24"/>
+          <w:szCs w:val="24"/>
         </w:rPr>
         <w:t>electron_temperature_jet_base</w:t>
       </w:r>
@@ -1114,31 +1506,55 @@
           <w:b/>
           <w:bCs/>
           <w:color w:val="1F497D" w:themeColor="text2"/>
+          <w:sz w:val="24"/>
+          <w:szCs w:val="24"/>
+        </w:rPr>
+        <w:t xml:space="preserve">); </w:t>
+      </w:r>
+      <w:r>
+        <w:rPr>
+          <w:rFonts w:asciiTheme="minorHAnsi" w:hAnsiTheme="minorHAnsi"/>
+          <w:color w:val="1F497D" w:themeColor="text2"/>
+          <w:sz w:val="24"/>
+          <w:szCs w:val="24"/>
+        </w:rPr>
+        <w:t xml:space="preserve">this is in units of keV. </w:t>
+      </w:r>
+      <w:r>
+        <w:rPr>
+          <w:rFonts w:asciiTheme="minorHAnsi" w:hAnsiTheme="minorHAnsi"/>
+          <w:color w:val="1F497D" w:themeColor="text2"/>
+          <w:sz w:val="24"/>
+          <w:szCs w:val="24"/>
+        </w:rPr>
+        <w:t>(</w:t>
+      </w:r>
+      <w:r>
+        <w:rPr>
+          <w:rFonts w:asciiTheme="minorHAnsi" w:hAnsiTheme="minorHAnsi"/>
+          <w:color w:val="1F497D" w:themeColor="text2"/>
+          <w:sz w:val="24"/>
+          <w:szCs w:val="24"/>
+        </w:rPr>
+        <w:t>Remember that the electron rest mass energy is 511 keV</w:t>
+      </w:r>
+      <w:r>
+        <w:rPr>
+          <w:rFonts w:asciiTheme="minorHAnsi" w:hAnsiTheme="minorHAnsi"/>
+          <w:color w:val="1F497D" w:themeColor="text2"/>
+          <w:sz w:val="24"/>
+          <w:szCs w:val="24"/>
         </w:rPr>
         <w:t>)</w:t>
       </w:r>
       <w:r>
         <w:rPr>
           <w:rFonts w:asciiTheme="minorHAnsi" w:hAnsiTheme="minorHAnsi"/>
-          <w:b/>
-          <w:bCs/>
-          <w:color w:val="1F497D" w:themeColor="text2"/>
-        </w:rPr>
-        <w:t xml:space="preserve">; </w:t>
-      </w:r>
-      <w:r>
-        <w:rPr>
-          <w:rFonts w:asciiTheme="minorHAnsi" w:hAnsiTheme="minorHAnsi"/>
-          <w:color w:val="1F497D" w:themeColor="text2"/>
-        </w:rPr>
-        <w:t>this is in units of keV</w:t>
-      </w:r>
-      <w:r>
-        <w:rPr>
-          <w:rFonts w:asciiTheme="minorHAnsi" w:hAnsiTheme="minorHAnsi"/>
-          <w:color w:val="1F497D" w:themeColor="text2"/>
-        </w:rPr>
-        <w:t xml:space="preserve">. Remember that the electron rest mass energy is 511 keV. </w:t>
+          <w:color w:val="1F497D" w:themeColor="text2"/>
+          <w:sz w:val="24"/>
+          <w:szCs w:val="24"/>
+        </w:rPr>
+        <w:t xml:space="preserve">. </w:t>
       </w:r>
     </w:p>
     <w:p>
@@ -1151,12 +1567,16 @@
         <w:rPr>
           <w:rFonts w:asciiTheme="minorHAnsi" w:hAnsiTheme="minorHAnsi"/>
           <w:color w:val="1F497D" w:themeColor="text2"/>
-        </w:rPr>
-      </w:pPr>
-      <w:r>
-        <w:rPr>
-          <w:rFonts w:asciiTheme="minorHAnsi" w:hAnsiTheme="minorHAnsi"/>
-          <w:color w:val="1F497D" w:themeColor="text2"/>
+          <w:sz w:val="24"/>
+          <w:szCs w:val="24"/>
+        </w:rPr>
+      </w:pPr>
+      <w:r>
+        <w:rPr>
+          <w:rFonts w:asciiTheme="minorHAnsi" w:hAnsiTheme="minorHAnsi"/>
+          <w:color w:val="1F497D" w:themeColor="text2"/>
+          <w:sz w:val="24"/>
+          <w:szCs w:val="24"/>
         </w:rPr>
         <w:t>Which parts of the SED respond most strongly?</w:t>
       </w:r>
@@ -1171,14 +1591,27 @@
         <w:rPr>
           <w:rFonts w:asciiTheme="minorHAnsi" w:hAnsiTheme="minorHAnsi"/>
           <w:color w:val="1F497D" w:themeColor="text2"/>
-        </w:rPr>
-      </w:pPr>
-      <w:r>
-        <w:rPr>
-          <w:rFonts w:asciiTheme="minorHAnsi" w:hAnsiTheme="minorHAnsi"/>
-          <w:color w:val="1F497D" w:themeColor="text2"/>
+          <w:sz w:val="24"/>
+          <w:szCs w:val="24"/>
+        </w:rPr>
+      </w:pPr>
+      <w:r>
+        <w:rPr>
+          <w:rFonts w:asciiTheme="minorHAnsi" w:hAnsiTheme="minorHAnsi"/>
+          <w:color w:val="1F497D" w:themeColor="text2"/>
+          <w:sz w:val="24"/>
+          <w:szCs w:val="24"/>
         </w:rPr>
         <w:t>Does this primarily affect emission before or after particle acceleration?</w:t>
+      </w:r>
+      <w:r>
+        <w:rPr>
+          <w:rFonts w:asciiTheme="minorHAnsi" w:hAnsiTheme="minorHAnsi"/>
+          <w:color w:val="1F497D" w:themeColor="text2"/>
+          <w:sz w:val="24"/>
+          <w:szCs w:val="24"/>
+        </w:rPr>
+        <w:t xml:space="preserve"> </w:t>
       </w:r>
     </w:p>
     <w:p>
@@ -1188,6 +1621,8 @@
         <w:rPr>
           <w:rFonts w:asciiTheme="minorHAnsi" w:hAnsiTheme="minorHAnsi"/>
           <w:color w:val="1F497D" w:themeColor="text2"/>
+          <w:sz w:val="24"/>
+          <w:szCs w:val="24"/>
         </w:rPr>
       </w:pPr>
     </w:p>
@@ -1201,35 +1636,18 @@
         <w:rPr>
           <w:rFonts w:asciiTheme="minorHAnsi" w:hAnsiTheme="minorHAnsi"/>
           <w:color w:val="1F497D" w:themeColor="text2"/>
-        </w:rPr>
-      </w:pPr>
-      <w:r>
-        <w:rPr>
-          <w:rFonts w:asciiTheme="minorHAnsi" w:hAnsiTheme="minorHAnsi"/>
-          <w:color w:val="1F497D" w:themeColor="text2"/>
-        </w:rPr>
-        <w:t>Increase</w:t>
-      </w:r>
-      <w:r>
-        <w:rPr>
-          <w:rFonts w:asciiTheme="minorHAnsi" w:hAnsiTheme="minorHAnsi"/>
-          <w:color w:val="1F497D" w:themeColor="text2"/>
-        </w:rPr>
-        <w:t xml:space="preserve"> the fraction of electrons that are accelerated into a non-thermal </w:t>
-      </w:r>
-      <w:r>
-        <w:rPr>
-          <w:rFonts w:asciiTheme="minorHAnsi" w:hAnsiTheme="minorHAnsi"/>
-          <w:color w:val="1F497D" w:themeColor="text2"/>
-        </w:rPr>
-        <w:t>distribution</w:t>
-      </w:r>
-      <w:r>
-        <w:rPr>
-          <w:rFonts w:asciiTheme="minorHAnsi" w:hAnsiTheme="minorHAnsi"/>
-          <w:color w:val="1F497D" w:themeColor="text2"/>
-        </w:rPr>
-        <w:t xml:space="preserve"> (</w:t>
+          <w:sz w:val="24"/>
+          <w:szCs w:val="24"/>
+        </w:rPr>
+      </w:pPr>
+      <w:r>
+        <w:rPr>
+          <w:rFonts w:asciiTheme="minorHAnsi" w:hAnsiTheme="minorHAnsi"/>
+          <w:color w:val="1F497D" w:themeColor="text2"/>
+          <w:sz w:val="24"/>
+          <w:szCs w:val="24"/>
+        </w:rPr>
+        <w:t>Increase the fraction of electrons that are accelerated into a non-thermal distribution (</w:t>
       </w:r>
       <w:proofErr w:type="spellStart"/>
       <w:r>
@@ -1239,8 +1657,8 @@
           <w:b/>
           <w:bCs/>
           <w:color w:val="1F497D" w:themeColor="text2"/>
-          <w:sz w:val="22"/>
-          <w:szCs w:val="22"/>
+          <w:sz w:val="24"/>
+          <w:szCs w:val="24"/>
         </w:rPr>
         <w:t>fraction_nonthermal_electrons</w:t>
       </w:r>
@@ -1249,15 +1667,19 @@
         <w:rPr>
           <w:rFonts w:asciiTheme="minorHAnsi" w:hAnsiTheme="minorHAnsi"/>
           <w:color w:val="1F497D" w:themeColor="text2"/>
-        </w:rPr>
-        <w:t>).</w:t>
-      </w:r>
-      <w:r>
-        <w:rPr>
-          <w:rFonts w:asciiTheme="minorHAnsi" w:hAnsiTheme="minorHAnsi"/>
-          <w:color w:val="1F497D" w:themeColor="text2"/>
-        </w:rPr>
-        <w:t xml:space="preserve"> </w:t>
+          <w:sz w:val="24"/>
+          <w:szCs w:val="24"/>
+        </w:rPr>
+        <w:t>)</w:t>
+      </w:r>
+      <w:r>
+        <w:rPr>
+          <w:rFonts w:asciiTheme="minorHAnsi" w:hAnsiTheme="minorHAnsi"/>
+          <w:color w:val="1F497D" w:themeColor="text2"/>
+          <w:sz w:val="24"/>
+          <w:szCs w:val="24"/>
+        </w:rPr>
+        <w:t xml:space="preserve"> from those thermal leptons. </w:t>
       </w:r>
     </w:p>
     <w:p>
@@ -1270,21 +1692,18 @@
         <w:rPr>
           <w:rFonts w:asciiTheme="minorHAnsi" w:hAnsiTheme="minorHAnsi"/>
           <w:color w:val="1F497D" w:themeColor="text2"/>
-        </w:rPr>
-      </w:pPr>
-      <w:r>
-        <w:rPr>
-          <w:rFonts w:asciiTheme="minorHAnsi" w:hAnsiTheme="minorHAnsi"/>
-          <w:color w:val="1F497D" w:themeColor="text2"/>
-        </w:rPr>
-        <w:t xml:space="preserve"> </w:t>
-      </w:r>
-      <w:r>
-        <w:rPr>
-          <w:rFonts w:asciiTheme="minorHAnsi" w:hAnsiTheme="minorHAnsi"/>
-          <w:color w:val="1F497D" w:themeColor="text2"/>
-        </w:rPr>
-        <w:t xml:space="preserve">What do you think it implies about the particle acceleration process if we assume a higher number of particles can be accelerated? </w:t>
+          <w:sz w:val="24"/>
+          <w:szCs w:val="24"/>
+        </w:rPr>
+      </w:pPr>
+      <w:r>
+        <w:rPr>
+          <w:rFonts w:asciiTheme="minorHAnsi" w:hAnsiTheme="minorHAnsi"/>
+          <w:color w:val="1F497D" w:themeColor="text2"/>
+          <w:sz w:val="24"/>
+          <w:szCs w:val="24"/>
+        </w:rPr>
+        <w:t xml:space="preserve"> What do you think it implies about the particle acceleration process if we assume a higher number of particles can be accelerated? </w:t>
       </w:r>
     </w:p>
     <w:p>
@@ -1297,12 +1716,16 @@
         <w:rPr>
           <w:rFonts w:asciiTheme="minorHAnsi" w:hAnsiTheme="minorHAnsi"/>
           <w:color w:val="1F497D" w:themeColor="text2"/>
-        </w:rPr>
-      </w:pPr>
-      <w:r>
-        <w:rPr>
-          <w:rFonts w:asciiTheme="minorHAnsi" w:hAnsiTheme="minorHAnsi"/>
-          <w:color w:val="1F497D" w:themeColor="text2"/>
+          <w:sz w:val="24"/>
+          <w:szCs w:val="24"/>
+        </w:rPr>
+      </w:pPr>
+      <w:r>
+        <w:rPr>
+          <w:rFonts w:asciiTheme="minorHAnsi" w:hAnsiTheme="minorHAnsi"/>
+          <w:color w:val="1F497D" w:themeColor="text2"/>
+          <w:sz w:val="24"/>
+          <w:szCs w:val="24"/>
         </w:rPr>
         <w:t>What happens to the synchrotron and inverse Compton components?</w:t>
       </w:r>
@@ -1317,28 +1740,18 @@
         <w:rPr>
           <w:rFonts w:asciiTheme="minorHAnsi" w:hAnsiTheme="minorHAnsi"/>
           <w:color w:val="1F497D" w:themeColor="text2"/>
-        </w:rPr>
-      </w:pPr>
-      <w:r>
-        <w:rPr>
-          <w:rFonts w:asciiTheme="minorHAnsi" w:hAnsiTheme="minorHAnsi"/>
-          <w:color w:val="1F497D" w:themeColor="text2"/>
-        </w:rPr>
-        <w:t>Prediction</w:t>
-      </w:r>
-      <w:r>
-        <w:rPr>
-          <w:rFonts w:asciiTheme="minorHAnsi" w:hAnsiTheme="minorHAnsi"/>
-          <w:color w:val="1F497D" w:themeColor="text2"/>
-        </w:rPr>
-        <w:t>:</w:t>
-      </w:r>
-      <w:r>
-        <w:rPr>
-          <w:rFonts w:asciiTheme="minorHAnsi" w:hAnsiTheme="minorHAnsi"/>
-          <w:color w:val="1F497D" w:themeColor="text2"/>
-        </w:rPr>
-        <w:t xml:space="preserve"> </w:t>
+          <w:sz w:val="24"/>
+          <w:szCs w:val="24"/>
+        </w:rPr>
+      </w:pPr>
+      <w:r>
+        <w:rPr>
+          <w:rFonts w:asciiTheme="minorHAnsi" w:hAnsiTheme="minorHAnsi"/>
+          <w:color w:val="1F497D" w:themeColor="text2"/>
+          <w:sz w:val="24"/>
+          <w:szCs w:val="24"/>
+        </w:rPr>
+        <w:t xml:space="preserve">Prediction: </w:t>
       </w:r>
     </w:p>
     <w:p>
@@ -1351,15 +1764,55 @@
         <w:rPr>
           <w:rFonts w:asciiTheme="minorHAnsi" w:hAnsiTheme="minorHAnsi"/>
           <w:color w:val="1F497D" w:themeColor="text2"/>
-        </w:rPr>
-      </w:pPr>
-      <w:r>
-        <w:rPr>
-          <w:rFonts w:asciiTheme="minorHAnsi" w:hAnsiTheme="minorHAnsi"/>
-          <w:color w:val="1F497D" w:themeColor="text2"/>
+          <w:sz w:val="24"/>
+          <w:szCs w:val="24"/>
+        </w:rPr>
+      </w:pPr>
+      <w:r>
+        <w:rPr>
+          <w:rFonts w:asciiTheme="minorHAnsi" w:hAnsiTheme="minorHAnsi"/>
+          <w:color w:val="1F497D" w:themeColor="text2"/>
+          <w:sz w:val="24"/>
+          <w:szCs w:val="24"/>
         </w:rPr>
         <w:t xml:space="preserve">Result: </w:t>
       </w:r>
+    </w:p>
+    <w:p>
+      <w:pPr>
+        <w:pStyle w:val="ListParagraph"/>
+        <w:numPr>
+          <w:ilvl w:val="1"/>
+          <w:numId w:val="11"/>
+        </w:numPr>
+        <w:rPr>
+          <w:rFonts w:asciiTheme="minorHAnsi" w:hAnsiTheme="minorHAnsi"/>
+          <w:color w:val="1F497D" w:themeColor="text2"/>
+          <w:sz w:val="24"/>
+          <w:szCs w:val="24"/>
+        </w:rPr>
+      </w:pPr>
+      <w:r>
+        <w:rPr>
+          <w:rFonts w:asciiTheme="minorHAnsi" w:hAnsiTheme="minorHAnsi"/>
+          <w:color w:val="1F497D" w:themeColor="text2"/>
+          <w:sz w:val="24"/>
+          <w:szCs w:val="24"/>
+        </w:rPr>
+        <w:t xml:space="preserve">What impact does changing the temperature of the thermal leptons have on the non-thermal particles? </w:t>
+      </w:r>
+    </w:p>
+    <w:p>
+      <w:pPr>
+        <w:pStyle w:val="ListParagraph"/>
+        <w:ind w:left="1440"/>
+        <w:rPr>
+          <w:rFonts w:asciiTheme="minorHAnsi" w:hAnsiTheme="minorHAnsi"/>
+          <w:color w:val="1F497D" w:themeColor="text2"/>
+          <w:sz w:val="24"/>
+          <w:szCs w:val="24"/>
+        </w:rPr>
+      </w:pPr>
     </w:p>
     <w:p>
       <w:pPr>
@@ -1371,13 +1824,18 @@
         <w:rPr>
           <w:rFonts w:asciiTheme="minorHAnsi" w:hAnsiTheme="minorHAnsi"/>
           <w:color w:val="1F497D" w:themeColor="text2"/>
-        </w:rPr>
-      </w:pPr>
-      <w:r>
-        <w:rPr>
-          <w:rFonts w:asciiTheme="minorHAnsi" w:hAnsiTheme="minorHAnsi"/>
-          <w:color w:val="1F497D" w:themeColor="text2"/>
-        </w:rPr>
+          <w:sz w:val="24"/>
+          <w:szCs w:val="24"/>
+        </w:rPr>
+      </w:pPr>
+      <w:r>
+        <w:rPr>
+          <w:rFonts w:asciiTheme="minorHAnsi" w:hAnsiTheme="minorHAnsi"/>
+          <w:color w:val="1F497D" w:themeColor="text2"/>
+          <w:sz w:val="24"/>
+          <w:szCs w:val="24"/>
+        </w:rPr>
+        <w:lastRenderedPageBreak/>
         <w:t>Change the slope of the injected electron distribution (</w:t>
       </w:r>
       <w:proofErr w:type="spellStart"/>
@@ -1388,8 +1846,8 @@
           <w:b/>
           <w:bCs/>
           <w:color w:val="1F497D" w:themeColor="text2"/>
-          <w:sz w:val="22"/>
-          <w:szCs w:val="22"/>
+          <w:sz w:val="24"/>
+          <w:szCs w:val="24"/>
         </w:rPr>
         <w:t>index_injected_electrons</w:t>
       </w:r>
@@ -1398,43 +1856,10 @@
         <w:rPr>
           <w:rFonts w:asciiTheme="minorHAnsi" w:hAnsiTheme="minorHAnsi"/>
           <w:color w:val="1F497D" w:themeColor="text2"/>
-        </w:rPr>
-        <w:t>). Try both a harder</w:t>
-      </w:r>
-      <w:r>
-        <w:rPr>
-          <w:rFonts w:asciiTheme="minorHAnsi" w:hAnsiTheme="minorHAnsi"/>
-          <w:color w:val="1F497D" w:themeColor="text2"/>
-        </w:rPr>
-        <w:t xml:space="preserve"> (smaller value)</w:t>
-      </w:r>
-      <w:r>
-        <w:rPr>
-          <w:rFonts w:asciiTheme="minorHAnsi" w:hAnsiTheme="minorHAnsi"/>
-          <w:color w:val="1F497D" w:themeColor="text2"/>
-        </w:rPr>
-        <w:t xml:space="preserve"> and a softer </w:t>
-      </w:r>
-      <w:r>
-        <w:rPr>
-          <w:rFonts w:asciiTheme="minorHAnsi" w:hAnsiTheme="minorHAnsi"/>
-          <w:color w:val="1F497D" w:themeColor="text2"/>
-        </w:rPr>
-        <w:t xml:space="preserve">(larger value) </w:t>
-      </w:r>
-      <w:r>
-        <w:rPr>
-          <w:rFonts w:asciiTheme="minorHAnsi" w:hAnsiTheme="minorHAnsi"/>
-          <w:color w:val="1F497D" w:themeColor="text2"/>
-        </w:rPr>
-        <w:t>electron distribution.</w:t>
-      </w:r>
-      <w:r>
-        <w:rPr>
-          <w:rFonts w:asciiTheme="minorHAnsi" w:hAnsiTheme="minorHAnsi"/>
-          <w:color w:val="1F497D" w:themeColor="text2"/>
-        </w:rPr>
-        <w:t xml:space="preserve"> </w:t>
+          <w:sz w:val="24"/>
+          <w:szCs w:val="24"/>
+        </w:rPr>
+        <w:t xml:space="preserve">). Try both a harder (smaller value) and a softer (larger value) electron distribution. </w:t>
       </w:r>
     </w:p>
     <w:p>
@@ -1447,85 +1872,612 @@
         <w:rPr>
           <w:rFonts w:asciiTheme="minorHAnsi" w:hAnsiTheme="minorHAnsi"/>
           <w:color w:val="1F497D" w:themeColor="text2"/>
-        </w:rPr>
-      </w:pPr>
-      <w:r>
-        <w:rPr>
-          <w:rFonts w:asciiTheme="minorHAnsi" w:hAnsiTheme="minorHAnsi"/>
-          <w:color w:val="1F497D" w:themeColor="text2"/>
+          <w:sz w:val="24"/>
+          <w:szCs w:val="24"/>
+        </w:rPr>
+      </w:pPr>
+      <w:r>
+        <w:rPr>
+          <w:rFonts w:asciiTheme="minorHAnsi" w:hAnsiTheme="minorHAnsi"/>
+          <w:color w:val="1F497D" w:themeColor="text2"/>
+          <w:sz w:val="24"/>
+          <w:szCs w:val="24"/>
         </w:rPr>
         <w:t>What do you think the slope of the accelerated electron distribution might tell you?</w:t>
       </w:r>
     </w:p>
     <w:p>
       <w:pPr>
-        <w:rPr>
-          <w:rFonts w:asciiTheme="minorHAnsi" w:hAnsiTheme="minorHAnsi"/>
-          <w:color w:val="1F497D" w:themeColor="text2"/>
-        </w:rPr>
-      </w:pPr>
-    </w:p>
-    <w:tbl>
-      <w:tblPr>
-        <w:tblW w:w="9360" w:type="dxa"/>
-        <w:tblLayout w:type="fixed"/>
-        <w:tblLook w:val="04A0" w:firstRow="1" w:lastRow="0" w:firstColumn="1" w:lastColumn="0" w:noHBand="0" w:noVBand="1"/>
-      </w:tblPr>
-      <w:tblGrid>
-        <w:gridCol w:w="9360"/>
-      </w:tblGrid>
-      <w:tr>
-        <w:tc>
-          <w:tcPr>
-            <w:tcW w:w="9360" w:type="dxa"/>
-            <w:shd w:val="clear" w:color="auto" w:fill="F7F7F7"/>
-            <w:tcMar>
-              <w:top w:w="80" w:type="dxa"/>
-              <w:left w:w="120" w:type="dxa"/>
-              <w:bottom w:w="80" w:type="dxa"/>
-              <w:right w:w="120" w:type="dxa"/>
-            </w:tcMar>
-          </w:tcPr>
-          <w:p>
-            <w:pPr>
-              <w:spacing w:before="360" w:after="360"/>
-              <w:jc w:val="center"/>
-              <w:rPr>
-                <w:rFonts w:asciiTheme="minorHAnsi" w:hAnsiTheme="minorHAnsi"/>
-                <w:color w:val="1F497D" w:themeColor="text2"/>
-              </w:rPr>
-            </w:pPr>
-            <w:r>
-              <w:rPr>
-                <w:rFonts w:asciiTheme="minorHAnsi" w:hAnsiTheme="minorHAnsi"/>
-                <w:color w:val="1F497D" w:themeColor="text2"/>
-              </w:rPr>
-              <w:t>Screenshot box (if wanted)</w:t>
-            </w:r>
-          </w:p>
-        </w:tc>
-      </w:tr>
-    </w:tbl>
-    <w:p>
-      <w:pPr>
-        <w:rPr>
-          <w:rFonts w:asciiTheme="minorHAnsi" w:hAnsiTheme="minorHAnsi"/>
-          <w:color w:val="1F497D" w:themeColor="text2"/>
-        </w:rPr>
-      </w:pPr>
-      <w:r>
-        <w:rPr>
-          <w:rFonts w:asciiTheme="minorHAnsi" w:hAnsiTheme="minorHAnsi"/>
-          <w:color w:val="1F497D" w:themeColor="text2"/>
-        </w:rPr>
-        <w:br w:type="page"/>
-      </w:r>
+        <w:pStyle w:val="ListParagraph"/>
+        <w:rPr>
+          <w:rFonts w:asciiTheme="minorHAnsi" w:hAnsiTheme="minorHAnsi"/>
+          <w:color w:val="1F497D" w:themeColor="text2"/>
+        </w:rPr>
+      </w:pPr>
     </w:p>
     <w:p>
       <w:pPr>
+        <w:pStyle w:val="ListParagraph"/>
+        <w:rPr>
+          <w:rFonts w:asciiTheme="minorHAnsi" w:hAnsiTheme="minorHAnsi"/>
+          <w:color w:val="1F497D" w:themeColor="text2"/>
+        </w:rPr>
+      </w:pPr>
+    </w:p>
+    <w:p>
+      <w:pPr>
+        <w:pStyle w:val="ListParagraph"/>
+        <w:rPr>
+          <w:rFonts w:asciiTheme="minorHAnsi" w:hAnsiTheme="minorHAnsi"/>
+          <w:color w:val="1F497D" w:themeColor="text2"/>
+        </w:rPr>
+      </w:pPr>
+    </w:p>
+    <w:p>
+      <w:pPr>
+        <w:pStyle w:val="ListParagraph"/>
+        <w:ind w:left="360"/>
+        <w:rPr>
+          <w:rFonts w:asciiTheme="minorHAnsi" w:hAnsiTheme="minorHAnsi"/>
+          <w:b/>
+          <w:bCs/>
+          <w:color w:val="1F497D" w:themeColor="text2"/>
+          <w:sz w:val="24"/>
+          <w:szCs w:val="24"/>
+        </w:rPr>
+      </w:pPr>
+      <w:r>
+        <w:rPr>
+          <w:rFonts w:asciiTheme="minorHAnsi" w:hAnsiTheme="minorHAnsi"/>
+          <w:b/>
+          <w:bCs/>
+          <w:color w:val="1F497D" w:themeColor="text2"/>
+          <w:sz w:val="24"/>
+          <w:szCs w:val="24"/>
+        </w:rPr>
+        <w:t>Jet Properties</w:t>
+      </w:r>
+    </w:p>
+    <w:p>
+      <w:pPr>
+        <w:ind w:left="360"/>
+        <w:rPr>
+          <w:rFonts w:asciiTheme="minorHAnsi" w:hAnsiTheme="minorHAnsi"/>
+          <w:color w:val="1F497D" w:themeColor="text2"/>
+          <w:sz w:val="24"/>
+          <w:szCs w:val="24"/>
+        </w:rPr>
+      </w:pPr>
+      <w:r>
+        <w:rPr>
+          <w:rFonts w:asciiTheme="minorHAnsi" w:hAnsiTheme="minorHAnsi"/>
+          <w:color w:val="1F497D" w:themeColor="text2"/>
+          <w:sz w:val="24"/>
+          <w:szCs w:val="24"/>
+        </w:rPr>
+        <w:t xml:space="preserve">Small discussion and the assumptions that we make about how the jet is accelerated, otherwise this question seems unfair - (E.g. something like we assume that magnetic fields around the black hole and accretion disk play a big role in the formation of </w:t>
+      </w:r>
+      <w:proofErr w:type="gramStart"/>
+      <w:r>
+        <w:rPr>
+          <w:rFonts w:asciiTheme="minorHAnsi" w:hAnsiTheme="minorHAnsi"/>
+          <w:color w:val="1F497D" w:themeColor="text2"/>
+          <w:sz w:val="24"/>
+          <w:szCs w:val="24"/>
+        </w:rPr>
+        <w:t>jets, and</w:t>
+      </w:r>
+      <w:proofErr w:type="gramEnd"/>
+      <w:r>
+        <w:rPr>
+          <w:rFonts w:asciiTheme="minorHAnsi" w:hAnsiTheme="minorHAnsi"/>
+          <w:color w:val="1F497D" w:themeColor="text2"/>
+          <w:sz w:val="24"/>
+          <w:szCs w:val="24"/>
+        </w:rPr>
+        <w:t xml:space="preserve"> also help them to accelerate. Therefore, our model is parametrized to assume that the </w:t>
+      </w:r>
+      <w:r>
+        <w:rPr>
+          <w:rFonts w:asciiTheme="minorHAnsi" w:hAnsiTheme="minorHAnsi"/>
+          <w:color w:val="1F497D" w:themeColor="text2"/>
+          <w:sz w:val="24"/>
+          <w:szCs w:val="24"/>
+        </w:rPr>
+        <w:t xml:space="preserve">division of energy from the injected power is unbalanced: we assume that </w:t>
+      </w:r>
+      <w:r>
+        <w:rPr>
+          <w:rFonts w:asciiTheme="minorHAnsi" w:hAnsiTheme="minorHAnsi"/>
+          <w:color w:val="1F497D" w:themeColor="text2"/>
+          <w:sz w:val="24"/>
+          <w:szCs w:val="24"/>
+        </w:rPr>
+        <w:t>energy in the magnetic field is higher than the energy in the particles, and the jet uses this magnetic energy to accelerate and reach the value (</w:t>
+      </w:r>
+      <w:proofErr w:type="spellStart"/>
+      <w:r>
+        <w:rPr>
+          <w:rFonts w:asciiTheme="minorHAnsi" w:hAnsiTheme="minorHAnsi"/>
+          <w:b/>
+          <w:bCs/>
+          <w:color w:val="1F497D" w:themeColor="text2"/>
+          <w:sz w:val="24"/>
+          <w:szCs w:val="24"/>
+        </w:rPr>
+        <w:t>Gamma_final</w:t>
+      </w:r>
+      <w:proofErr w:type="spellEnd"/>
+      <w:r>
+        <w:rPr>
+          <w:rFonts w:asciiTheme="minorHAnsi" w:hAnsiTheme="minorHAnsi"/>
+          <w:color w:val="1F497D" w:themeColor="text2"/>
+          <w:sz w:val="24"/>
+          <w:szCs w:val="24"/>
+        </w:rPr>
+        <w:t>)</w:t>
+      </w:r>
+      <w:r>
+        <w:rPr>
+          <w:rFonts w:asciiTheme="minorHAnsi" w:hAnsiTheme="minorHAnsi"/>
+          <w:color w:val="1F497D" w:themeColor="text2"/>
+          <w:sz w:val="24"/>
+          <w:szCs w:val="24"/>
+        </w:rPr>
+        <w:t>. We</w:t>
+      </w:r>
+      <w:r>
+        <w:rPr>
+          <w:rFonts w:asciiTheme="minorHAnsi" w:hAnsiTheme="minorHAnsi"/>
+          <w:color w:val="1F497D" w:themeColor="text2"/>
+          <w:sz w:val="24"/>
+          <w:szCs w:val="24"/>
+        </w:rPr>
+        <w:t xml:space="preserve"> can sometimes estimate </w:t>
+      </w:r>
+      <w:r>
+        <w:rPr>
+          <w:rFonts w:asciiTheme="minorHAnsi" w:hAnsiTheme="minorHAnsi"/>
+          <w:color w:val="1F497D" w:themeColor="text2"/>
+          <w:sz w:val="24"/>
+          <w:szCs w:val="24"/>
+        </w:rPr>
+        <w:t xml:space="preserve">what jet Lorentz factors are from observations of nearby systems. </w:t>
+      </w:r>
+    </w:p>
+    <w:p>
+      <w:pPr>
+        <w:ind w:left="360"/>
+        <w:rPr>
+          <w:rFonts w:asciiTheme="minorHAnsi" w:hAnsiTheme="minorHAnsi"/>
+          <w:color w:val="1F497D" w:themeColor="text2"/>
+          <w:sz w:val="24"/>
+          <w:szCs w:val="24"/>
+        </w:rPr>
+      </w:pPr>
+      <w:r>
+        <w:rPr>
+          <w:rFonts w:asciiTheme="minorHAnsi" w:hAnsiTheme="minorHAnsi"/>
+          <w:color w:val="1F497D" w:themeColor="text2"/>
+          <w:sz w:val="24"/>
+          <w:szCs w:val="24"/>
+        </w:rPr>
+        <w:t xml:space="preserve">Change the maximum jet Lorentz factor </w:t>
+      </w:r>
+      <w:r>
+        <w:rPr>
+          <w:rFonts w:asciiTheme="minorHAnsi" w:hAnsiTheme="minorHAnsi"/>
+          <w:color w:val="1F497D" w:themeColor="text2"/>
+          <w:sz w:val="24"/>
+          <w:szCs w:val="24"/>
+        </w:rPr>
+        <w:t>(</w:t>
+      </w:r>
+      <w:proofErr w:type="spellStart"/>
+      <w:r>
+        <w:rPr>
+          <w:rFonts w:asciiTheme="minorHAnsi" w:hAnsiTheme="minorHAnsi"/>
+          <w:b/>
+          <w:bCs/>
+          <w:color w:val="1F497D" w:themeColor="text2"/>
+          <w:sz w:val="24"/>
+          <w:szCs w:val="24"/>
+        </w:rPr>
+        <w:t>Gamma_final</w:t>
+      </w:r>
+      <w:proofErr w:type="spellEnd"/>
+      <w:r>
+        <w:rPr>
+          <w:rFonts w:asciiTheme="minorHAnsi" w:hAnsiTheme="minorHAnsi"/>
+          <w:color w:val="1F497D" w:themeColor="text2"/>
+          <w:sz w:val="24"/>
+          <w:szCs w:val="24"/>
+        </w:rPr>
+        <w:t>)</w:t>
+      </w:r>
+      <w:r>
+        <w:rPr>
+          <w:rFonts w:asciiTheme="minorHAnsi" w:hAnsiTheme="minorHAnsi"/>
+          <w:color w:val="1F497D" w:themeColor="text2"/>
+          <w:sz w:val="24"/>
+          <w:szCs w:val="24"/>
+        </w:rPr>
+        <w:t xml:space="preserve">. </w:t>
+      </w:r>
+    </w:p>
+    <w:p>
+      <w:pPr>
+        <w:pStyle w:val="ListParagraph"/>
+        <w:numPr>
+          <w:ilvl w:val="1"/>
+          <w:numId w:val="11"/>
+        </w:numPr>
+        <w:rPr>
+          <w:rFonts w:asciiTheme="minorHAnsi" w:hAnsiTheme="minorHAnsi"/>
+          <w:color w:val="1F497D" w:themeColor="text2"/>
+          <w:sz w:val="24"/>
+          <w:szCs w:val="24"/>
+        </w:rPr>
+      </w:pPr>
+      <w:r>
+        <w:rPr>
+          <w:rFonts w:asciiTheme="minorHAnsi" w:hAnsiTheme="minorHAnsi"/>
+          <w:color w:val="1F497D" w:themeColor="text2"/>
+          <w:sz w:val="24"/>
+          <w:szCs w:val="24"/>
+        </w:rPr>
+        <w:t xml:space="preserve">If you make the jet faster, what do you need more of? </w:t>
+      </w:r>
+    </w:p>
+    <w:p>
+      <w:pPr>
+        <w:pStyle w:val="ListParagraph"/>
+        <w:numPr>
+          <w:ilvl w:val="1"/>
+          <w:numId w:val="11"/>
+        </w:numPr>
+        <w:rPr>
+          <w:rFonts w:asciiTheme="minorHAnsi" w:hAnsiTheme="minorHAnsi"/>
+          <w:color w:val="1F497D" w:themeColor="text2"/>
+          <w:sz w:val="24"/>
+          <w:szCs w:val="24"/>
+        </w:rPr>
+      </w:pPr>
+      <w:r>
+        <w:rPr>
+          <w:rFonts w:asciiTheme="minorHAnsi" w:hAnsiTheme="minorHAnsi"/>
+          <w:color w:val="1F497D" w:themeColor="text2"/>
+          <w:sz w:val="24"/>
+          <w:szCs w:val="24"/>
+        </w:rPr>
+        <w:t xml:space="preserve">What does this do to the particles and their radiation? </w:t>
+      </w:r>
+    </w:p>
+    <w:p>
+      <w:pPr>
+        <w:pStyle w:val="ListParagraph"/>
+        <w:numPr>
+          <w:ilvl w:val="1"/>
+          <w:numId w:val="11"/>
+        </w:numPr>
+        <w:rPr>
+          <w:rFonts w:asciiTheme="minorHAnsi" w:hAnsiTheme="minorHAnsi"/>
+          <w:color w:val="1F497D" w:themeColor="text2"/>
+          <w:sz w:val="24"/>
+          <w:szCs w:val="24"/>
+        </w:rPr>
+      </w:pPr>
+      <w:r>
+        <w:rPr>
+          <w:rFonts w:asciiTheme="minorHAnsi" w:hAnsiTheme="minorHAnsi"/>
+          <w:color w:val="1F497D" w:themeColor="text2"/>
+          <w:sz w:val="24"/>
+          <w:szCs w:val="24"/>
+        </w:rPr>
+        <w:t xml:space="preserve">Now, make </w:t>
+      </w:r>
+      <w:r>
+        <w:rPr>
+          <w:rFonts w:asciiTheme="minorHAnsi" w:hAnsiTheme="minorHAnsi"/>
+          <w:color w:val="1F497D" w:themeColor="text2"/>
+          <w:sz w:val="24"/>
+          <w:szCs w:val="24"/>
+        </w:rPr>
+        <w:t>the</w:t>
+      </w:r>
+      <w:r>
+        <w:rPr>
+          <w:rFonts w:asciiTheme="minorHAnsi" w:hAnsiTheme="minorHAnsi"/>
+          <w:color w:val="1F497D" w:themeColor="text2"/>
+          <w:sz w:val="24"/>
+          <w:szCs w:val="24"/>
+        </w:rPr>
+        <w:t xml:space="preserve"> viewing angle (</w:t>
+      </w:r>
+      <w:proofErr w:type="spellStart"/>
+      <w:r>
+        <w:rPr>
+          <w:rFonts w:asciiTheme="minorHAnsi" w:hAnsiTheme="minorHAnsi"/>
+          <w:b/>
+          <w:bCs/>
+          <w:color w:val="1F497D" w:themeColor="text2"/>
+          <w:sz w:val="24"/>
+          <w:szCs w:val="24"/>
+        </w:rPr>
+        <w:t>theta_obs</w:t>
+      </w:r>
+      <w:proofErr w:type="spellEnd"/>
+      <w:r>
+        <w:rPr>
+          <w:rFonts w:asciiTheme="minorHAnsi" w:hAnsiTheme="minorHAnsi"/>
+          <w:color w:val="1F497D" w:themeColor="text2"/>
+          <w:sz w:val="24"/>
+          <w:szCs w:val="24"/>
+        </w:rPr>
+        <w:t>)</w:t>
+      </w:r>
+      <w:r>
+        <w:rPr>
+          <w:rFonts w:asciiTheme="minorHAnsi" w:hAnsiTheme="minorHAnsi"/>
+          <w:color w:val="1F497D" w:themeColor="text2"/>
+          <w:sz w:val="24"/>
+          <w:szCs w:val="24"/>
+        </w:rPr>
+        <w:t xml:space="preserve"> smaller. What is happening with the radiation from the jet? (Hint: now this is unrelated to particle vs magnetic energy amounts)</w:t>
+      </w:r>
+    </w:p>
+    <w:p>
+      <w:pPr>
+        <w:pStyle w:val="ListParagraph"/>
+        <w:ind w:left="1440"/>
+        <w:rPr>
+          <w:rFonts w:asciiTheme="minorHAnsi" w:hAnsiTheme="minorHAnsi"/>
+          <w:color w:val="1F497D" w:themeColor="text2"/>
+          <w:sz w:val="24"/>
+          <w:szCs w:val="24"/>
+        </w:rPr>
+      </w:pPr>
+    </w:p>
+    <w:p>
+      <w:pPr>
+        <w:pStyle w:val="ListParagraph"/>
+        <w:numPr>
+          <w:ilvl w:val="0"/>
+          <w:numId w:val="11"/>
+        </w:numPr>
+        <w:rPr>
+          <w:rFonts w:asciiTheme="minorHAnsi" w:hAnsiTheme="minorHAnsi"/>
+          <w:color w:val="1F497D" w:themeColor="text2"/>
+          <w:sz w:val="24"/>
+          <w:szCs w:val="24"/>
+        </w:rPr>
+      </w:pPr>
+      <w:r>
+        <w:rPr>
+          <w:rFonts w:asciiTheme="minorHAnsi" w:hAnsiTheme="minorHAnsi"/>
+          <w:color w:val="1F497D" w:themeColor="text2"/>
+          <w:sz w:val="24"/>
+          <w:szCs w:val="24"/>
+        </w:rPr>
+        <w:t>Change the magnetization</w:t>
+      </w:r>
+      <w:r>
+        <w:rPr>
+          <w:rFonts w:asciiTheme="minorHAnsi" w:hAnsiTheme="minorHAnsi"/>
+          <w:color w:val="1F497D" w:themeColor="text2"/>
+          <w:sz w:val="24"/>
+          <w:szCs w:val="24"/>
+        </w:rPr>
+        <w:t xml:space="preserve"> </w:t>
+      </w:r>
+      <w:r>
+        <w:rPr>
+          <w:rFonts w:asciiTheme="minorHAnsi" w:hAnsiTheme="minorHAnsi"/>
+          <w:color w:val="1F497D" w:themeColor="text2"/>
+          <w:sz w:val="24"/>
+          <w:szCs w:val="24"/>
+        </w:rPr>
+        <w:t>(</w:t>
+      </w:r>
+      <w:proofErr w:type="spellStart"/>
+      <w:r>
+        <w:rPr>
+          <w:rFonts w:asciiTheme="minorHAnsi" w:hAnsiTheme="minorHAnsi"/>
+          <w:b/>
+          <w:bCs/>
+          <w:color w:val="1F497D" w:themeColor="text2"/>
+          <w:sz w:val="24"/>
+          <w:szCs w:val="24"/>
+        </w:rPr>
+        <w:t>sigma_final</w:t>
+      </w:r>
+      <w:proofErr w:type="spellEnd"/>
+      <w:r>
+        <w:rPr>
+          <w:rFonts w:asciiTheme="minorHAnsi" w:hAnsiTheme="minorHAnsi"/>
+          <w:b/>
+          <w:bCs/>
+          <w:color w:val="1F497D" w:themeColor="text2"/>
+          <w:sz w:val="24"/>
+          <w:szCs w:val="24"/>
+        </w:rPr>
+        <w:t>)</w:t>
+      </w:r>
+      <w:r>
+        <w:rPr>
+          <w:rFonts w:asciiTheme="minorHAnsi" w:hAnsiTheme="minorHAnsi"/>
+          <w:color w:val="1F497D" w:themeColor="text2"/>
+          <w:sz w:val="24"/>
+          <w:szCs w:val="24"/>
+        </w:rPr>
+        <w:t xml:space="preserve"> </w:t>
+      </w:r>
+      <w:r>
+        <w:rPr>
+          <w:rFonts w:asciiTheme="minorHAnsi" w:hAnsiTheme="minorHAnsi"/>
+          <w:color w:val="1F497D" w:themeColor="text2"/>
+          <w:sz w:val="24"/>
+          <w:szCs w:val="24"/>
+        </w:rPr>
+        <w:t>where the jet achieves its maximum acceleration (</w:t>
+      </w:r>
+      <w:r>
+        <w:rPr>
+          <w:rFonts w:asciiTheme="minorHAnsi" w:hAnsiTheme="minorHAnsi"/>
+          <w:color w:val="1F497D" w:themeColor="text2"/>
+          <w:sz w:val="24"/>
+          <w:szCs w:val="24"/>
+        </w:rPr>
+        <w:t>i.e.</w:t>
+      </w:r>
+      <w:r>
+        <w:rPr>
+          <w:rFonts w:asciiTheme="minorHAnsi" w:hAnsiTheme="minorHAnsi"/>
+          <w:color w:val="1F497D" w:themeColor="text2"/>
+          <w:sz w:val="24"/>
+          <w:szCs w:val="24"/>
+        </w:rPr>
+        <w:t xml:space="preserve"> it has reached the value of Gamma that we set, and now we can change how much energy is leftover in the magnetic field after the jet has used some of that energy to accelerate</w:t>
+      </w:r>
+      <w:r>
+        <w:rPr>
+          <w:rFonts w:asciiTheme="minorHAnsi" w:hAnsiTheme="minorHAnsi"/>
+          <w:color w:val="1F497D" w:themeColor="text2"/>
+          <w:sz w:val="24"/>
+          <w:szCs w:val="24"/>
+        </w:rPr>
+        <w:t>)</w:t>
+      </w:r>
+    </w:p>
+    <w:p>
+      <w:pPr>
+        <w:pStyle w:val="ListParagraph"/>
+        <w:numPr>
+          <w:ilvl w:val="1"/>
+          <w:numId w:val="11"/>
+        </w:numPr>
+        <w:rPr>
+          <w:rFonts w:asciiTheme="minorHAnsi" w:hAnsiTheme="minorHAnsi"/>
+          <w:color w:val="1F497D" w:themeColor="text2"/>
+          <w:sz w:val="24"/>
+          <w:szCs w:val="24"/>
+        </w:rPr>
+      </w:pPr>
+      <w:r>
+        <w:rPr>
+          <w:rFonts w:asciiTheme="minorHAnsi" w:hAnsiTheme="minorHAnsi"/>
+          <w:color w:val="1F497D" w:themeColor="text2"/>
+          <w:sz w:val="24"/>
+          <w:szCs w:val="24"/>
+        </w:rPr>
+        <w:t xml:space="preserve">What does changing the balance between magnetic and particle energy do to synchrotron emission? </w:t>
+      </w:r>
+      <w:r>
+        <w:rPr>
+          <w:rFonts w:asciiTheme="minorHAnsi" w:hAnsiTheme="minorHAnsi"/>
+          <w:color w:val="1F497D" w:themeColor="text2"/>
+          <w:sz w:val="24"/>
+          <w:szCs w:val="24"/>
+        </w:rPr>
+        <w:t>What do you know about synchrotron radiation that would explain this? (</w:t>
+      </w:r>
+      <w:r>
+        <w:rPr>
+          <w:rFonts w:asciiTheme="minorHAnsi" w:hAnsiTheme="minorHAnsi"/>
+          <w:color w:val="1F497D" w:themeColor="text2"/>
+          <w:sz w:val="24"/>
+          <w:szCs w:val="24"/>
+        </w:rPr>
+        <w:t>i.e</w:t>
+      </w:r>
+      <w:r>
+        <w:rPr>
+          <w:rFonts w:asciiTheme="minorHAnsi" w:hAnsiTheme="minorHAnsi"/>
+          <w:color w:val="1F497D" w:themeColor="text2"/>
+          <w:sz w:val="24"/>
+          <w:szCs w:val="24"/>
+        </w:rPr>
+        <w:t>. look at the equation again</w:t>
+      </w:r>
+      <w:r>
+        <w:rPr>
+          <w:rFonts w:asciiTheme="minorHAnsi" w:hAnsiTheme="minorHAnsi"/>
+          <w:color w:val="1F497D" w:themeColor="text2"/>
+          <w:sz w:val="24"/>
+          <w:szCs w:val="24"/>
+        </w:rPr>
+        <w:t xml:space="preserve"> from the slides</w:t>
+      </w:r>
+      <w:r>
+        <w:rPr>
+          <w:rFonts w:asciiTheme="minorHAnsi" w:hAnsiTheme="minorHAnsi"/>
+          <w:color w:val="1F497D" w:themeColor="text2"/>
+          <w:sz w:val="24"/>
+          <w:szCs w:val="24"/>
+        </w:rPr>
+        <w:t xml:space="preserve">!) </w:t>
+      </w:r>
+    </w:p>
+    <w:p>
+      <w:pPr>
         <w:shd w:val="clear" w:color="auto" w:fill="FFFFFF"/>
         <w:spacing w:after="0" w:line="270" w:lineRule="atLeast"/>
         <w:rPr>
+          <w:rFonts w:asciiTheme="minorHAnsi" w:hAnsiTheme="minorHAnsi"/>
+          <w:color w:val="1F497D" w:themeColor="text2"/>
+          <w:sz w:val="40"/>
+        </w:rPr>
+      </w:pPr>
+    </w:p>
+    <w:p>
+      <w:pPr>
+        <w:shd w:val="clear" w:color="auto" w:fill="FFFFFF"/>
+        <w:spacing w:after="0" w:line="270" w:lineRule="atLeast"/>
+        <w:rPr>
+          <w:rFonts w:asciiTheme="minorHAnsi" w:hAnsiTheme="minorHAnsi"/>
+          <w:color w:val="1F497D" w:themeColor="text2"/>
+          <w:sz w:val="40"/>
+        </w:rPr>
+      </w:pPr>
+    </w:p>
+    <w:p>
+      <w:pPr>
+        <w:shd w:val="clear" w:color="auto" w:fill="FFFFFF"/>
+        <w:spacing w:after="0" w:line="270" w:lineRule="atLeast"/>
+        <w:rPr>
+          <w:rFonts w:asciiTheme="minorHAnsi" w:hAnsiTheme="minorHAnsi"/>
+          <w:color w:val="1F497D" w:themeColor="text2"/>
+          <w:sz w:val="40"/>
+        </w:rPr>
+      </w:pPr>
+    </w:p>
+    <w:p>
+      <w:pPr>
+        <w:shd w:val="clear" w:color="auto" w:fill="FFFFFF"/>
+        <w:spacing w:after="0" w:line="270" w:lineRule="atLeast"/>
+        <w:rPr>
+          <w:rFonts w:asciiTheme="minorHAnsi" w:hAnsiTheme="minorHAnsi"/>
+          <w:color w:val="1F497D" w:themeColor="text2"/>
+          <w:sz w:val="40"/>
+        </w:rPr>
+      </w:pPr>
+    </w:p>
+    <w:p>
+      <w:pPr>
+        <w:shd w:val="clear" w:color="auto" w:fill="FFFFFF"/>
+        <w:spacing w:after="0" w:line="270" w:lineRule="atLeast"/>
+        <w:rPr>
+          <w:rFonts w:asciiTheme="minorHAnsi" w:hAnsiTheme="minorHAnsi"/>
+          <w:color w:val="1F497D" w:themeColor="text2"/>
+          <w:sz w:val="40"/>
+        </w:rPr>
+      </w:pPr>
+    </w:p>
+    <w:p>
+      <w:pPr>
+        <w:shd w:val="clear" w:color="auto" w:fill="FFFFFF"/>
+        <w:spacing w:after="0" w:line="270" w:lineRule="atLeast"/>
+        <w:rPr>
           <w:rFonts w:asciiTheme="minorHAnsi" w:eastAsia="Times New Roman" w:hAnsiTheme="minorHAnsi" w:cs="Menlo"/>
           <w:color w:val="1F497D" w:themeColor="text2"/>
           <w:sz w:val="18"/>
@@ -1573,7 +2525,7 @@
           <w:sz w:val="40"/>
           <w:szCs w:val="40"/>
         </w:rPr>
-        <w:t>Using BHJet to study multi-wavelength observations of jetted systems</w:t>
+        <w:t xml:space="preserve">Understanding emission along the jet </w:t>
       </w:r>
     </w:p>
     <w:p>
@@ -1581,43 +2533,23 @@
         <w:spacing w:before="400" w:after="120"/>
         <w:rPr>
           <w:rFonts w:asciiTheme="minorHAnsi" w:hAnsiTheme="minorHAnsi"/>
-          <w:color w:val="1F497D" w:themeColor="text2"/>
-          <w:sz w:val="24"/>
-          <w:szCs w:val="24"/>
-          <w:u w:val="single"/>
-        </w:rPr>
-      </w:pPr>
-      <w:r>
-        <w:rPr>
-          <w:rFonts w:asciiTheme="minorHAnsi" w:hAnsiTheme="minorHAnsi"/>
-          <w:color w:val="1F497D" w:themeColor="text2"/>
-          <w:sz w:val="24"/>
-          <w:szCs w:val="24"/>
-          <w:u w:val="single"/>
-        </w:rPr>
-        <w:t xml:space="preserve">Selecting a </w:t>
-      </w:r>
-      <w:proofErr w:type="gramStart"/>
-      <w:r>
-        <w:rPr>
-          <w:rFonts w:asciiTheme="minorHAnsi" w:hAnsiTheme="minorHAnsi"/>
-          <w:color w:val="1F497D" w:themeColor="text2"/>
-          <w:sz w:val="24"/>
-          <w:szCs w:val="24"/>
-          <w:u w:val="single"/>
-        </w:rPr>
-        <w:t>source &amp; loading observations</w:t>
-      </w:r>
-      <w:proofErr w:type="gramEnd"/>
-      <w:r>
-        <w:rPr>
-          <w:rFonts w:asciiTheme="minorHAnsi" w:hAnsiTheme="minorHAnsi"/>
-          <w:color w:val="1F497D" w:themeColor="text2"/>
-          <w:sz w:val="24"/>
-          <w:szCs w:val="24"/>
-          <w:u w:val="single"/>
-        </w:rPr>
-        <w:t xml:space="preserve">: </w:t>
+          <w:b/>
+          <w:bCs/>
+          <w:color w:val="1F497D" w:themeColor="text2"/>
+          <w:sz w:val="24"/>
+          <w:szCs w:val="24"/>
+        </w:rPr>
+      </w:pPr>
+      <w:r>
+        <w:rPr>
+          <w:rFonts w:asciiTheme="minorHAnsi" w:hAnsiTheme="minorHAnsi"/>
+          <w:b/>
+          <w:bCs/>
+          <w:color w:val="1F497D" w:themeColor="text2"/>
+          <w:sz w:val="24"/>
+          <w:szCs w:val="24"/>
+        </w:rPr>
+        <w:t xml:space="preserve">Creating a single emission zone: </w:t>
       </w:r>
     </w:p>
     <w:p>
@@ -1631,58 +2563,207 @@
         <w:rPr>
           <w:rFonts w:asciiTheme="minorHAnsi" w:hAnsiTheme="minorHAnsi"/>
           <w:color w:val="1F497D" w:themeColor="text2"/>
-        </w:rPr>
-      </w:pPr>
-      <w:r>
-        <w:rPr>
-          <w:rFonts w:asciiTheme="minorHAnsi" w:hAnsiTheme="minorHAnsi"/>
-          <w:color w:val="1F497D" w:themeColor="text2"/>
-        </w:rPr>
-        <w:t>S</w:t>
-      </w:r>
-      <w:r>
-        <w:rPr>
-          <w:rFonts w:asciiTheme="minorHAnsi" w:hAnsiTheme="minorHAnsi"/>
-          <w:color w:val="1F497D" w:themeColor="text2"/>
-        </w:rPr>
-        <w:t xml:space="preserve">tarting with MWL observations of M87, the source-specific values are taken from either the Nasa Extragalactic Dataset or recent publications </w:t>
-      </w:r>
-      <w:r>
-        <w:rPr>
-          <w:rFonts w:asciiTheme="minorHAnsi" w:hAnsiTheme="minorHAnsi"/>
-          <w:color w:val="1F497D" w:themeColor="text2"/>
-        </w:rPr>
-        <w:t>on</w:t>
-      </w:r>
-      <w:r>
-        <w:rPr>
-          <w:rFonts w:asciiTheme="minorHAnsi" w:hAnsiTheme="minorHAnsi"/>
-          <w:color w:val="1F497D" w:themeColor="text2"/>
-        </w:rPr>
-        <w:t xml:space="preserve"> M87.  </w:t>
+          <w:sz w:val="24"/>
+          <w:szCs w:val="24"/>
+        </w:rPr>
+      </w:pPr>
+      <w:r>
+        <w:rPr>
+          <w:rFonts w:asciiTheme="minorHAnsi" w:hAnsiTheme="minorHAnsi"/>
+          <w:color w:val="1F497D" w:themeColor="text2"/>
+          <w:sz w:val="24"/>
+          <w:szCs w:val="24"/>
+        </w:rPr>
+        <w:t xml:space="preserve">What </w:t>
+      </w:r>
+      <w:r>
+        <w:rPr>
+          <w:rFonts w:asciiTheme="minorHAnsi" w:hAnsiTheme="minorHAnsi"/>
+          <w:color w:val="1F497D" w:themeColor="text2"/>
+          <w:sz w:val="24"/>
+          <w:szCs w:val="24"/>
+        </w:rPr>
+        <w:t xml:space="preserve">does it mean to use only one zone? </w:t>
       </w:r>
     </w:p>
     <w:p>
       <w:pPr>
         <w:pStyle w:val="ListParagraph"/>
+        <w:numPr>
+          <w:ilvl w:val="1"/>
+          <w:numId w:val="10"/>
+        </w:numPr>
         <w:spacing w:before="400" w:after="120"/>
-        <w:ind w:left="360"/>
-        <w:rPr>
-          <w:rFonts w:asciiTheme="minorHAnsi" w:hAnsiTheme="minorHAnsi"/>
-          <w:color w:val="1F497D" w:themeColor="text2"/>
-        </w:rPr>
-      </w:pPr>
+        <w:rPr>
+          <w:rFonts w:asciiTheme="minorHAnsi" w:hAnsiTheme="minorHAnsi"/>
+          <w:color w:val="1F497D" w:themeColor="text2"/>
+          <w:sz w:val="24"/>
+          <w:szCs w:val="24"/>
+        </w:rPr>
+      </w:pPr>
+      <w:r>
+        <w:rPr>
+          <w:rFonts w:asciiTheme="minorHAnsi" w:hAnsiTheme="minorHAnsi"/>
+          <w:color w:val="1F497D" w:themeColor="text2"/>
+          <w:sz w:val="24"/>
+          <w:szCs w:val="24"/>
+        </w:rPr>
+        <w:t xml:space="preserve">What are we assuming about radiation </w:t>
+      </w:r>
+      <w:r>
+        <w:rPr>
+          <w:rFonts w:asciiTheme="minorHAnsi" w:hAnsiTheme="minorHAnsi"/>
+          <w:color w:val="1F497D" w:themeColor="text2"/>
+          <w:sz w:val="24"/>
+          <w:szCs w:val="24"/>
+        </w:rPr>
+        <w:t xml:space="preserve">that we calculate here, in terms of the shape, size, and conditions in the blob versus what we observe in accreting systems: i.e. an extended jet? </w:t>
+      </w:r>
     </w:p>
     <w:p>
       <w:pPr>
         <w:pStyle w:val="ListParagraph"/>
+        <w:numPr>
+          <w:ilvl w:val="1"/>
+          <w:numId w:val="10"/>
+        </w:numPr>
         <w:spacing w:before="400" w:after="120"/>
-        <w:ind w:left="360"/>
-        <w:rPr>
-          <w:rFonts w:asciiTheme="minorHAnsi" w:hAnsiTheme="minorHAnsi"/>
-          <w:color w:val="1F497D" w:themeColor="text2"/>
-        </w:rPr>
-      </w:pPr>
+        <w:rPr>
+          <w:rFonts w:asciiTheme="minorHAnsi" w:hAnsiTheme="minorHAnsi"/>
+          <w:color w:val="1F497D" w:themeColor="text2"/>
+          <w:sz w:val="24"/>
+          <w:szCs w:val="24"/>
+        </w:rPr>
+      </w:pPr>
+      <w:r>
+        <w:rPr>
+          <w:rFonts w:asciiTheme="minorHAnsi" w:hAnsiTheme="minorHAnsi"/>
+          <w:color w:val="1F497D" w:themeColor="text2"/>
+          <w:sz w:val="24"/>
+          <w:szCs w:val="24"/>
+        </w:rPr>
+        <w:t xml:space="preserve">Why do you think this is an okay approximation to make? </w:t>
+      </w:r>
+    </w:p>
+    <w:p>
+      <w:pPr>
+        <w:pStyle w:val="ListParagraph"/>
+        <w:numPr>
+          <w:ilvl w:val="1"/>
+          <w:numId w:val="10"/>
+        </w:numPr>
+        <w:spacing w:before="400" w:after="120"/>
+        <w:rPr>
+          <w:rFonts w:asciiTheme="minorHAnsi" w:hAnsiTheme="minorHAnsi"/>
+          <w:color w:val="1F497D" w:themeColor="text2"/>
+          <w:sz w:val="24"/>
+          <w:szCs w:val="24"/>
+        </w:rPr>
+      </w:pPr>
+      <w:r>
+        <w:rPr>
+          <w:rFonts w:asciiTheme="minorHAnsi" w:hAnsiTheme="minorHAnsi"/>
+          <w:color w:val="1F497D" w:themeColor="text2"/>
+          <w:sz w:val="24"/>
+          <w:szCs w:val="24"/>
+        </w:rPr>
+        <w:t xml:space="preserve">Where do you </w:t>
+      </w:r>
+      <w:proofErr w:type="gramStart"/>
+      <w:r>
+        <w:rPr>
+          <w:rFonts w:asciiTheme="minorHAnsi" w:hAnsiTheme="minorHAnsi"/>
+          <w:color w:val="1F497D" w:themeColor="text2"/>
+          <w:sz w:val="24"/>
+          <w:szCs w:val="24"/>
+        </w:rPr>
+        <w:t>think</w:t>
+      </w:r>
+      <w:proofErr w:type="gramEnd"/>
+      <w:r>
+        <w:rPr>
+          <w:rFonts w:asciiTheme="minorHAnsi" w:hAnsiTheme="minorHAnsi"/>
+          <w:color w:val="1F497D" w:themeColor="text2"/>
+          <w:sz w:val="24"/>
+          <w:szCs w:val="24"/>
+        </w:rPr>
+        <w:t xml:space="preserve"> it will start to break down? </w:t>
+      </w:r>
+    </w:p>
+    <w:p>
+      <w:pPr>
+        <w:spacing w:before="400" w:after="120"/>
+        <w:rPr>
+          <w:rFonts w:asciiTheme="minorHAnsi" w:hAnsiTheme="minorHAnsi"/>
+          <w:b/>
+          <w:bCs/>
+          <w:color w:val="1F497D" w:themeColor="text2"/>
+          <w:sz w:val="24"/>
+          <w:szCs w:val="24"/>
+        </w:rPr>
+      </w:pPr>
+      <w:r>
+        <w:rPr>
+          <w:rFonts w:asciiTheme="minorHAnsi" w:hAnsiTheme="minorHAnsi"/>
+          <w:b/>
+          <w:bCs/>
+          <w:color w:val="1F497D" w:themeColor="text2"/>
+          <w:sz w:val="24"/>
+          <w:szCs w:val="24"/>
+        </w:rPr>
+        <w:t xml:space="preserve">Compare the single “blob” with observations of M87: </w:t>
+      </w:r>
+    </w:p>
+    <w:p>
+      <w:pPr>
+        <w:spacing w:before="400" w:after="120"/>
+        <w:rPr>
+          <w:rFonts w:asciiTheme="minorHAnsi" w:hAnsiTheme="minorHAnsi"/>
+          <w:b/>
+          <w:bCs/>
+          <w:color w:val="1F497D" w:themeColor="text2"/>
+          <w:sz w:val="24"/>
+          <w:szCs w:val="24"/>
+        </w:rPr>
+      </w:pPr>
+      <w:r>
+        <w:rPr>
+          <w:rFonts w:asciiTheme="minorHAnsi" w:hAnsiTheme="minorHAnsi"/>
+          <w:color w:val="1F497D" w:themeColor="text2"/>
+          <w:sz w:val="24"/>
+          <w:szCs w:val="24"/>
+        </w:rPr>
+        <w:t>Now, you’re going to</w:t>
+      </w:r>
+      <w:r>
+        <w:rPr>
+          <w:rFonts w:asciiTheme="minorHAnsi" w:eastAsia="Times New Roman" w:hAnsiTheme="minorHAnsi" w:cs="Menlo"/>
+          <w:color w:val="034C7C"/>
+          <w:sz w:val="24"/>
+          <w:szCs w:val="24"/>
+        </w:rPr>
+        <w:t xml:space="preserve"> include observations of M87 with your</w:t>
+      </w:r>
+      <w:r>
+        <w:rPr>
+          <w:rFonts w:asciiTheme="minorHAnsi" w:eastAsia="Times New Roman" w:hAnsiTheme="minorHAnsi" w:cs="Menlo"/>
+          <w:b/>
+          <w:bCs/>
+          <w:color w:val="034C7C"/>
+          <w:sz w:val="24"/>
+          <w:szCs w:val="24"/>
+        </w:rPr>
+        <w:t xml:space="preserve"> </w:t>
+      </w:r>
+      <w:r>
+        <w:rPr>
+          <w:rFonts w:asciiTheme="minorHAnsi" w:eastAsia="Times New Roman" w:hAnsiTheme="minorHAnsi" w:cs="Menlo"/>
+          <w:color w:val="034C7C"/>
+          <w:sz w:val="24"/>
+          <w:szCs w:val="24"/>
+        </w:rPr>
+        <w:t xml:space="preserve">calculated spectrum and see what kind of changes you must make to the parameter space to get it to (roughly) match.  </w:t>
+      </w:r>
     </w:p>
     <w:p>
       <w:pPr>
@@ -1693,105 +2774,47 @@
         </w:numPr>
         <w:spacing w:before="400" w:after="120"/>
         <w:rPr>
-          <w:rFonts w:asciiTheme="minorHAnsi" w:hAnsiTheme="minorHAnsi"/>
-          <w:color w:val="1F497D" w:themeColor="text2"/>
-          <w:sz w:val="24"/>
-          <w:szCs w:val="24"/>
-        </w:rPr>
-      </w:pPr>
-      <w:r>
-        <w:rPr>
-          <w:rFonts w:asciiTheme="minorHAnsi" w:hAnsiTheme="minorHAnsi"/>
-          <w:color w:val="1F497D" w:themeColor="text2"/>
-          <w:sz w:val="24"/>
-          <w:szCs w:val="24"/>
-        </w:rPr>
-        <w:t xml:space="preserve">Load and inspect the M87 SED </w:t>
-      </w:r>
-    </w:p>
-    <w:p>
-      <w:pPr>
-        <w:pStyle w:val="ListParagraph"/>
-        <w:numPr>
-          <w:ilvl w:val="1"/>
-          <w:numId w:val="10"/>
-        </w:numPr>
-        <w:spacing w:before="400" w:after="120"/>
-        <w:rPr>
-          <w:rFonts w:asciiTheme="minorHAnsi" w:hAnsiTheme="minorHAnsi"/>
-          <w:color w:val="1F497D" w:themeColor="text2"/>
-        </w:rPr>
-      </w:pPr>
-      <w:r>
-        <w:rPr>
-          <w:rFonts w:asciiTheme="minorHAnsi" w:hAnsiTheme="minorHAnsi"/>
-          <w:color w:val="1F497D" w:themeColor="text2"/>
-        </w:rPr>
-        <w:t>The data is in units of energy (eV) and number flux (</w:t>
-      </w:r>
-      <w:proofErr w:type="spellStart"/>
-      <w:r>
-        <w:rPr>
-          <w:rFonts w:asciiTheme="minorHAnsi" w:hAnsiTheme="minorHAnsi"/>
-          <w:color w:val="1F497D" w:themeColor="text2"/>
-        </w:rPr>
-        <w:t>dN</w:t>
-      </w:r>
-      <w:proofErr w:type="spellEnd"/>
-      <w:r>
-        <w:rPr>
-          <w:rFonts w:asciiTheme="minorHAnsi" w:hAnsiTheme="minorHAnsi"/>
-          <w:color w:val="1F497D" w:themeColor="text2"/>
-        </w:rPr>
-        <w:t>/</w:t>
-      </w:r>
-      <w:proofErr w:type="spellStart"/>
-      <w:r>
-        <w:rPr>
-          <w:rFonts w:asciiTheme="minorHAnsi" w:hAnsiTheme="minorHAnsi"/>
-          <w:color w:val="1F497D" w:themeColor="text2"/>
-        </w:rPr>
-        <w:t>dE</w:t>
-      </w:r>
-      <w:proofErr w:type="spellEnd"/>
-      <w:r>
-        <w:rPr>
-          <w:rFonts w:asciiTheme="minorHAnsi" w:hAnsiTheme="minorHAnsi"/>
-          <w:color w:val="1F497D" w:themeColor="text2"/>
-        </w:rPr>
-        <w:t xml:space="preserve">) (and flux error). However, it is typical to use E^2 </w:t>
-      </w:r>
-      <w:proofErr w:type="spellStart"/>
-      <w:r>
-        <w:rPr>
-          <w:rFonts w:asciiTheme="minorHAnsi" w:hAnsiTheme="minorHAnsi"/>
-          <w:color w:val="1F497D" w:themeColor="text2"/>
-        </w:rPr>
-        <w:t>dN</w:t>
-      </w:r>
-      <w:proofErr w:type="spellEnd"/>
-      <w:r>
-        <w:rPr>
-          <w:rFonts w:asciiTheme="minorHAnsi" w:hAnsiTheme="minorHAnsi"/>
-          <w:color w:val="1F497D" w:themeColor="text2"/>
-        </w:rPr>
-        <w:t>/</w:t>
-      </w:r>
-      <w:proofErr w:type="spellStart"/>
-      <w:r>
-        <w:rPr>
-          <w:rFonts w:asciiTheme="minorHAnsi" w:hAnsiTheme="minorHAnsi"/>
-          <w:color w:val="1F497D" w:themeColor="text2"/>
-        </w:rPr>
-        <w:t>dE</w:t>
-      </w:r>
-      <w:proofErr w:type="spellEnd"/>
-      <w:r>
-        <w:rPr>
-          <w:rFonts w:asciiTheme="minorHAnsi" w:hAnsiTheme="minorHAnsi"/>
-          <w:color w:val="1F497D" w:themeColor="text2"/>
-        </w:rPr>
-        <w:t xml:space="preserve">. </w:t>
+          <w:rFonts w:asciiTheme="minorHAnsi" w:eastAsia="Times New Roman" w:hAnsiTheme="minorHAnsi" w:cs="Menlo"/>
+          <w:color w:val="034C7C"/>
+          <w:sz w:val="24"/>
+          <w:szCs w:val="24"/>
+        </w:rPr>
+      </w:pPr>
+      <w:r>
+        <w:rPr>
+          <w:rFonts w:asciiTheme="minorHAnsi" w:hAnsiTheme="minorHAnsi"/>
+          <w:color w:val="1F497D" w:themeColor="text2"/>
+          <w:sz w:val="24"/>
+          <w:szCs w:val="24"/>
+        </w:rPr>
+        <w:t xml:space="preserve">Write down which </w:t>
+      </w:r>
+      <w:r>
+        <w:rPr>
+          <w:rFonts w:asciiTheme="minorHAnsi" w:hAnsiTheme="minorHAnsi"/>
+          <w:color w:val="1F497D" w:themeColor="text2"/>
+          <w:sz w:val="24"/>
+          <w:szCs w:val="24"/>
+        </w:rPr>
+        <w:t>parameters</w:t>
+      </w:r>
+      <w:r>
+        <w:rPr>
+          <w:rFonts w:asciiTheme="minorHAnsi" w:hAnsiTheme="minorHAnsi"/>
+          <w:color w:val="1F497D" w:themeColor="text2"/>
+          <w:sz w:val="24"/>
+          <w:szCs w:val="24"/>
+        </w:rPr>
+        <w:t xml:space="preserve"> had to be changed</w:t>
+      </w:r>
+      <w:r>
+        <w:rPr>
+          <w:rFonts w:asciiTheme="minorHAnsi" w:hAnsiTheme="minorHAnsi"/>
+          <w:color w:val="1F497D" w:themeColor="text2"/>
+          <w:sz w:val="24"/>
+          <w:szCs w:val="24"/>
+        </w:rPr>
+        <w:t xml:space="preserve">: </w:t>
       </w:r>
     </w:p>
     <w:p>
@@ -1800,42 +2823,167 @@
         <w:spacing w:before="400" w:after="120"/>
         <w:ind w:left="1080"/>
         <w:rPr>
-          <w:rFonts w:asciiTheme="minorHAnsi" w:hAnsiTheme="minorHAnsi"/>
-          <w:color w:val="1F497D" w:themeColor="text2"/>
+          <w:rFonts w:asciiTheme="minorHAnsi" w:eastAsia="Times New Roman" w:hAnsiTheme="minorHAnsi" w:cs="Menlo"/>
+          <w:color w:val="034C7C"/>
+          <w:sz w:val="24"/>
+          <w:szCs w:val="24"/>
         </w:rPr>
       </w:pPr>
     </w:p>
     <w:p>
       <w:pPr>
-        <w:pStyle w:val="ListParagraph"/>
-        <w:spacing w:before="400" w:after="120"/>
-        <w:ind w:left="360"/>
-        <w:rPr>
-          <w:rFonts w:asciiTheme="minorHAnsi" w:hAnsiTheme="minorHAnsi"/>
-          <w:color w:val="1F497D" w:themeColor="text2"/>
-        </w:rPr>
-      </w:pPr>
+        <w:shd w:val="clear" w:color="auto" w:fill="FFFFFF"/>
+        <w:spacing w:after="0" w:line="270" w:lineRule="atLeast"/>
+        <w:rPr>
+          <w:rFonts w:asciiTheme="minorHAnsi" w:eastAsia="Times New Roman" w:hAnsiTheme="minorHAnsi" w:cs="Menlo"/>
+          <w:b/>
+          <w:bCs/>
+          <w:color w:val="034C7C"/>
+          <w:sz w:val="24"/>
+          <w:szCs w:val="24"/>
+        </w:rPr>
+      </w:pPr>
+      <w:r>
+        <w:rPr>
+          <w:rFonts w:asciiTheme="minorHAnsi" w:eastAsia="Times New Roman" w:hAnsiTheme="minorHAnsi" w:cs="Menlo"/>
+          <w:b/>
+          <w:bCs/>
+          <w:color w:val="034C7C"/>
+          <w:sz w:val="24"/>
+          <w:szCs w:val="24"/>
+        </w:rPr>
+        <w:t>Build a multi-zone BHJet model</w:t>
+      </w:r>
+      <w:r>
+        <w:rPr>
+          <w:rFonts w:asciiTheme="minorHAnsi" w:eastAsia="Times New Roman" w:hAnsiTheme="minorHAnsi" w:cs="Menlo"/>
+          <w:b/>
+          <w:bCs/>
+          <w:color w:val="034C7C"/>
+          <w:sz w:val="24"/>
+          <w:szCs w:val="24"/>
+        </w:rPr>
+        <w:t xml:space="preserve">: </w:t>
+      </w:r>
     </w:p>
     <w:p>
       <w:pPr>
+        <w:shd w:val="clear" w:color="auto" w:fill="FFFFFF"/>
+        <w:spacing w:after="0" w:line="270" w:lineRule="atLeast"/>
+        <w:rPr>
+          <w:rFonts w:asciiTheme="minorHAnsi" w:eastAsia="Times New Roman" w:hAnsiTheme="minorHAnsi" w:cs="Menlo"/>
+          <w:b/>
+          <w:bCs/>
+          <w:color w:val="236EBF"/>
+          <w:sz w:val="24"/>
+          <w:szCs w:val="24"/>
+        </w:rPr>
+      </w:pPr>
+      <w:r>
+        <w:rPr>
+          <w:rFonts w:asciiTheme="minorHAnsi" w:hAnsiTheme="minorHAnsi"/>
+          <w:color w:val="1F497D" w:themeColor="text2"/>
+          <w:sz w:val="24"/>
+          <w:szCs w:val="24"/>
+        </w:rPr>
+        <w:t xml:space="preserve">Now, we’re going to </w:t>
+      </w:r>
+      <w:r>
+        <w:rPr>
+          <w:rFonts w:asciiTheme="minorHAnsi" w:hAnsiTheme="minorHAnsi"/>
+          <w:color w:val="1F497D" w:themeColor="text2"/>
+          <w:sz w:val="24"/>
+          <w:szCs w:val="24"/>
+        </w:rPr>
+        <w:t xml:space="preserve">produce many emission regions, rather than just one. </w:t>
+      </w:r>
+      <w:r>
+        <w:rPr>
+          <w:rFonts w:asciiTheme="minorHAnsi" w:hAnsiTheme="minorHAnsi"/>
+          <w:color w:val="1F497D" w:themeColor="text2"/>
+          <w:sz w:val="24"/>
+          <w:szCs w:val="24"/>
+        </w:rPr>
+        <w:t xml:space="preserve">We’ve provided the same skeleton of code to run the multi-zone BHJet model, and </w:t>
+      </w:r>
+    </w:p>
+    <w:p>
+      <w:pPr>
         <w:spacing w:before="400" w:after="120"/>
         <w:rPr>
           <w:rFonts w:asciiTheme="minorHAnsi" w:hAnsiTheme="minorHAnsi"/>
           <w:color w:val="1F497D" w:themeColor="text2"/>
           <w:sz w:val="24"/>
           <w:szCs w:val="24"/>
-          <w:u w:val="single"/>
-        </w:rPr>
-      </w:pPr>
-      <w:r>
-        <w:rPr>
-          <w:rFonts w:asciiTheme="minorHAnsi" w:hAnsiTheme="minorHAnsi"/>
-          <w:color w:val="1F497D" w:themeColor="text2"/>
-          <w:sz w:val="24"/>
-          <w:szCs w:val="24"/>
-          <w:u w:val="single"/>
-        </w:rPr>
-        <w:t xml:space="preserve">Creating a single emission zone: </w:t>
+        </w:rPr>
+      </w:pPr>
+    </w:p>
+    <w:p>
+      <w:pPr>
+        <w:shd w:val="clear" w:color="auto" w:fill="FFFFFF"/>
+        <w:spacing w:after="0" w:line="270" w:lineRule="atLeast"/>
+        <w:rPr>
+          <w:rFonts w:asciiTheme="minorHAnsi" w:eastAsia="Times New Roman" w:hAnsiTheme="minorHAnsi" w:cs="Menlo"/>
+          <w:b/>
+          <w:bCs/>
+          <w:color w:val="236EBF"/>
+          <w:sz w:val="24"/>
+          <w:szCs w:val="24"/>
+        </w:rPr>
+      </w:pPr>
+      <w:r>
+        <w:rPr>
+          <w:rFonts w:asciiTheme="minorHAnsi" w:eastAsia="Times New Roman" w:hAnsiTheme="minorHAnsi" w:cs="Menlo"/>
+          <w:b/>
+          <w:bCs/>
+          <w:color w:val="034C7C"/>
+          <w:sz w:val="24"/>
+          <w:szCs w:val="24"/>
+        </w:rPr>
+        <w:t>C</w:t>
+      </w:r>
+      <w:r>
+        <w:rPr>
+          <w:rFonts w:asciiTheme="minorHAnsi" w:eastAsia="Times New Roman" w:hAnsiTheme="minorHAnsi" w:cs="Menlo"/>
+          <w:b/>
+          <w:bCs/>
+          <w:color w:val="034C7C"/>
+          <w:sz w:val="24"/>
+          <w:szCs w:val="24"/>
+        </w:rPr>
+        <w:t>ompare the one-zone and multi-zone spectra</w:t>
+      </w:r>
+      <w:r>
+        <w:rPr>
+          <w:rFonts w:asciiTheme="minorHAnsi" w:eastAsia="Times New Roman" w:hAnsiTheme="minorHAnsi" w:cs="Menlo"/>
+          <w:b/>
+          <w:bCs/>
+          <w:color w:val="034C7C"/>
+          <w:sz w:val="24"/>
+          <w:szCs w:val="24"/>
+        </w:rPr>
+        <w:t xml:space="preserve">: </w:t>
+      </w:r>
+    </w:p>
+    <w:p>
+      <w:pPr>
+        <w:shd w:val="clear" w:color="auto" w:fill="FFFFFF"/>
+        <w:spacing w:after="0" w:line="270" w:lineRule="atLeast"/>
+        <w:rPr>
+          <w:rFonts w:asciiTheme="minorHAnsi" w:eastAsia="Times New Roman" w:hAnsiTheme="minorHAnsi" w:cs="Menlo"/>
+          <w:color w:val="1F497D" w:themeColor="text2"/>
+          <w:sz w:val="24"/>
+          <w:szCs w:val="24"/>
+        </w:rPr>
+      </w:pPr>
+      <w:r>
+        <w:rPr>
+          <w:rFonts w:asciiTheme="minorHAnsi" w:eastAsia="Times New Roman" w:hAnsiTheme="minorHAnsi" w:cs="Menlo"/>
+          <w:color w:val="1F497D" w:themeColor="text2"/>
+          <w:sz w:val="24"/>
+          <w:szCs w:val="24"/>
+        </w:rPr>
+        <w:t xml:space="preserve">The single-zone model is one set of local conditions. The multi-zone model sums many expanding zones, so its shape and normalization will probably not match the single-zone spectrum. </w:t>
       </w:r>
     </w:p>
     <w:p>
@@ -1856,23 +3004,19 @@
       <w:r>
         <w:rPr>
           <w:rFonts w:asciiTheme="minorHAnsi" w:hAnsiTheme="minorHAnsi"/>
-          <w:color w:val="1F497D" w:themeColor="text2"/>
-        </w:rPr>
-        <w:t xml:space="preserve">What </w:t>
-      </w:r>
-      <w:r>
-        <w:rPr>
-          <w:rFonts w:asciiTheme="minorHAnsi" w:hAnsiTheme="minorHAnsi"/>
-          <w:color w:val="1F497D" w:themeColor="text2"/>
-        </w:rPr>
-        <w:t xml:space="preserve">does it mean to use only one zone? What are we assuming about radiation that we end up seeing from the jet, which we know is much larger &amp; longer than our blob?   </w:t>
+          <w:bCs/>
+          <w:color w:val="1F497D" w:themeColor="text2"/>
+          <w:sz w:val="24"/>
+          <w:szCs w:val="24"/>
+        </w:rPr>
+        <w:t xml:space="preserve">Before calculating: how do you expect the multi-zone spectrum to differ from the single-zone spectrum? </w:t>
       </w:r>
     </w:p>
     <w:p>
       <w:pPr>
         <w:pStyle w:val="ListParagraph"/>
         <w:spacing w:before="400" w:after="120"/>
-        <w:ind w:left="1080"/>
+        <w:ind w:left="360"/>
         <w:rPr>
           <w:rFonts w:asciiTheme="minorHAnsi" w:hAnsiTheme="minorHAnsi"/>
           <w:color w:val="1F497D" w:themeColor="text2"/>
@@ -1900,40 +3044,203 @@
         <w:rPr>
           <w:rFonts w:asciiTheme="minorHAnsi" w:hAnsiTheme="minorHAnsi"/>
           <w:color w:val="1F497D" w:themeColor="text2"/>
-        </w:rPr>
-        <w:t xml:space="preserve">Why do you think this is an okay approximation to make? </w:t>
+          <w:sz w:val="24"/>
+          <w:szCs w:val="24"/>
+        </w:rPr>
+        <w:t xml:space="preserve">What do you have to change in the parameter space to get the multi-zone and single </w:t>
+      </w:r>
+      <w:proofErr w:type="gramStart"/>
+      <w:r>
+        <w:rPr>
+          <w:rFonts w:asciiTheme="minorHAnsi" w:hAnsiTheme="minorHAnsi"/>
+          <w:color w:val="1F497D" w:themeColor="text2"/>
+          <w:sz w:val="24"/>
+          <w:szCs w:val="24"/>
+        </w:rPr>
+        <w:t>zone  models</w:t>
+      </w:r>
+      <w:proofErr w:type="gramEnd"/>
+      <w:r>
+        <w:rPr>
+          <w:rFonts w:asciiTheme="minorHAnsi" w:hAnsiTheme="minorHAnsi"/>
+          <w:color w:val="1F497D" w:themeColor="text2"/>
+          <w:sz w:val="24"/>
+          <w:szCs w:val="24"/>
+        </w:rPr>
+        <w:t xml:space="preserve"> to have a similar flux/magnitude? </w:t>
       </w:r>
     </w:p>
     <w:p>
       <w:pPr>
-        <w:pStyle w:val="ListParagraph"/>
-        <w:rPr>
-          <w:rFonts w:asciiTheme="minorHAnsi" w:hAnsiTheme="minorHAnsi"/>
-          <w:color w:val="1F497D" w:themeColor="text2"/>
-          <w:sz w:val="24"/>
-          <w:szCs w:val="24"/>
+        <w:rPr>
+          <w:rFonts w:asciiTheme="minorHAnsi" w:hAnsiTheme="minorHAnsi"/>
+          <w:color w:val="1F497D" w:themeColor="text2"/>
         </w:rPr>
       </w:pPr>
     </w:p>
     <w:p>
       <w:pPr>
-        <w:pStyle w:val="ListParagraph"/>
+        <w:rPr>
+          <w:rFonts w:asciiTheme="minorHAnsi" w:hAnsiTheme="minorHAnsi"/>
+          <w:color w:val="1F497D" w:themeColor="text2"/>
+        </w:rPr>
+      </w:pPr>
+    </w:p>
+    <w:p>
+      <w:pPr>
+        <w:spacing w:after="80"/>
+        <w:rPr>
+          <w:rFonts w:asciiTheme="minorHAnsi" w:hAnsiTheme="minorHAnsi"/>
+          <w:color w:val="1F497D" w:themeColor="text2"/>
+        </w:rPr>
+      </w:pPr>
+    </w:p>
+    <w:p>
+      <w:pPr>
+        <w:rPr>
+          <w:rFonts w:asciiTheme="minorHAnsi" w:hAnsiTheme="minorHAnsi"/>
+          <w:color w:val="1F497D" w:themeColor="text2"/>
+        </w:rPr>
+      </w:pPr>
+    </w:p>
+    <w:p>
+      <w:pPr>
+        <w:rPr>
+          <w:rFonts w:asciiTheme="minorHAnsi" w:hAnsiTheme="minorHAnsi"/>
+          <w:color w:val="1F497D" w:themeColor="text2"/>
+        </w:rPr>
+      </w:pPr>
+    </w:p>
+    <w:p>
+      <w:pPr>
+        <w:rPr>
+          <w:rFonts w:asciiTheme="minorHAnsi" w:eastAsia="Times New Roman" w:hAnsiTheme="minorHAnsi" w:cs="Menlo"/>
+          <w:color w:val="1F497D" w:themeColor="text2"/>
+          <w:sz w:val="40"/>
+          <w:szCs w:val="40"/>
+        </w:rPr>
+      </w:pPr>
+      <w:r>
+        <w:rPr>
+          <w:rFonts w:asciiTheme="minorHAnsi" w:hAnsiTheme="minorHAnsi"/>
+          <w:color w:val="1F497D" w:themeColor="text2"/>
+          <w:sz w:val="40"/>
+          <w:szCs w:val="40"/>
+        </w:rPr>
+        <w:t>3</w:t>
+      </w:r>
+      <w:r>
+        <w:rPr>
+          <w:rFonts w:asciiTheme="minorHAnsi" w:hAnsiTheme="minorHAnsi"/>
+          <w:color w:val="1F497D" w:themeColor="text2"/>
+          <w:sz w:val="40"/>
+          <w:szCs w:val="40"/>
+          <w:vertAlign w:val="superscript"/>
+        </w:rPr>
+        <w:t>rd</w:t>
+      </w:r>
+      <w:r>
+        <w:rPr>
+          <w:rFonts w:asciiTheme="minorHAnsi" w:hAnsiTheme="minorHAnsi"/>
+          <w:color w:val="1F497D" w:themeColor="text2"/>
+          <w:sz w:val="40"/>
+          <w:szCs w:val="40"/>
+        </w:rPr>
+        <w:t xml:space="preserve"> Notebook:</w:t>
+      </w:r>
+      <w:r>
+        <w:rPr>
+          <w:rFonts w:asciiTheme="minorHAnsi" w:hAnsiTheme="minorHAnsi"/>
+          <w:color w:val="1F497D" w:themeColor="text2"/>
+        </w:rPr>
+        <w:t xml:space="preserve"> </w:t>
+      </w:r>
+      <w:r>
+        <w:rPr>
+          <w:rFonts w:asciiTheme="minorHAnsi" w:eastAsia="Times New Roman" w:hAnsiTheme="minorHAnsi" w:cs="Menlo"/>
+          <w:color w:val="1F497D" w:themeColor="text2"/>
+          <w:sz w:val="40"/>
+          <w:szCs w:val="40"/>
+        </w:rPr>
+        <w:t>Using BHJet to study multi-wavelength observations of jetted systems</w:t>
+      </w:r>
+    </w:p>
+    <w:p>
+      <w:pPr>
         <w:spacing w:before="400" w:after="120"/>
-        <w:ind w:left="1080"/>
-        <w:rPr>
-          <w:rFonts w:asciiTheme="minorHAnsi" w:hAnsiTheme="minorHAnsi"/>
-          <w:color w:val="1F497D" w:themeColor="text2"/>
-          <w:sz w:val="24"/>
-          <w:szCs w:val="24"/>
-        </w:rPr>
-      </w:pPr>
+        <w:rPr>
+          <w:rFonts w:asciiTheme="minorHAnsi" w:hAnsiTheme="minorHAnsi"/>
+          <w:b/>
+          <w:bCs/>
+          <w:color w:val="1F497D" w:themeColor="text2"/>
+          <w:sz w:val="24"/>
+          <w:szCs w:val="24"/>
+        </w:rPr>
+      </w:pPr>
+      <w:r>
+        <w:rPr>
+          <w:rFonts w:asciiTheme="minorHAnsi" w:hAnsiTheme="minorHAnsi"/>
+          <w:b/>
+          <w:bCs/>
+          <w:color w:val="1F497D" w:themeColor="text2"/>
+          <w:sz w:val="24"/>
+          <w:szCs w:val="24"/>
+        </w:rPr>
+        <w:t xml:space="preserve">Selecting a </w:t>
+      </w:r>
+      <w:proofErr w:type="gramStart"/>
+      <w:r>
+        <w:rPr>
+          <w:rFonts w:asciiTheme="minorHAnsi" w:hAnsiTheme="minorHAnsi"/>
+          <w:b/>
+          <w:bCs/>
+          <w:color w:val="1F497D" w:themeColor="text2"/>
+          <w:sz w:val="24"/>
+          <w:szCs w:val="24"/>
+        </w:rPr>
+        <w:t>source &amp; lo</w:t>
+      </w:r>
+      <w:r>
+        <w:rPr>
+          <w:rFonts w:asciiTheme="minorHAnsi" w:hAnsiTheme="minorHAnsi"/>
+          <w:b/>
+          <w:bCs/>
+          <w:color w:val="1F497D" w:themeColor="text2"/>
+          <w:sz w:val="24"/>
+          <w:szCs w:val="24"/>
+        </w:rPr>
+        <w:t>a</w:t>
+      </w:r>
+      <w:r>
+        <w:rPr>
+          <w:rFonts w:asciiTheme="minorHAnsi" w:hAnsiTheme="minorHAnsi"/>
+          <w:b/>
+          <w:bCs/>
+          <w:color w:val="1F497D" w:themeColor="text2"/>
+          <w:sz w:val="24"/>
+          <w:szCs w:val="24"/>
+        </w:rPr>
+        <w:t>ding observations</w:t>
+      </w:r>
+      <w:proofErr w:type="gramEnd"/>
+      <w:r>
+        <w:rPr>
+          <w:rFonts w:asciiTheme="minorHAnsi" w:hAnsiTheme="minorHAnsi"/>
+          <w:b/>
+          <w:bCs/>
+          <w:color w:val="1F497D" w:themeColor="text2"/>
+          <w:sz w:val="24"/>
+          <w:szCs w:val="24"/>
+        </w:rPr>
+        <w:t xml:space="preserve">: </w:t>
+      </w:r>
     </w:p>
     <w:p>
       <w:pPr>
         <w:pStyle w:val="ListParagraph"/>
         <w:numPr>
           <w:ilvl w:val="0"/>
-          <w:numId w:val="10"/>
+          <w:numId w:val="13"/>
         </w:numPr>
         <w:spacing w:before="400" w:after="120"/>
         <w:rPr>
@@ -1947,174 +3254,73 @@
         <w:rPr>
           <w:rFonts w:asciiTheme="minorHAnsi" w:hAnsiTheme="minorHAnsi"/>
           <w:color w:val="1F497D" w:themeColor="text2"/>
-        </w:rPr>
-        <w:t xml:space="preserve">Where do you </w:t>
-      </w:r>
-      <w:proofErr w:type="gramStart"/>
-      <w:r>
-        <w:rPr>
-          <w:rFonts w:asciiTheme="minorHAnsi" w:hAnsiTheme="minorHAnsi"/>
-          <w:color w:val="1F497D" w:themeColor="text2"/>
-        </w:rPr>
-        <w:t>think</w:t>
-      </w:r>
-      <w:proofErr w:type="gramEnd"/>
-      <w:r>
-        <w:rPr>
-          <w:rFonts w:asciiTheme="minorHAnsi" w:hAnsiTheme="minorHAnsi"/>
-          <w:color w:val="1F497D" w:themeColor="text2"/>
-        </w:rPr>
-        <w:t xml:space="preserve"> it will start to break down? </w:t>
+          <w:sz w:val="24"/>
+          <w:szCs w:val="24"/>
+        </w:rPr>
+        <w:t>Starting with MWL observations of M87</w:t>
+      </w:r>
+      <w:r>
+        <w:rPr>
+          <w:rFonts w:asciiTheme="minorHAnsi" w:hAnsiTheme="minorHAnsi"/>
+          <w:color w:val="1F497D" w:themeColor="text2"/>
+          <w:sz w:val="24"/>
+          <w:szCs w:val="24"/>
+        </w:rPr>
+        <w:t>: t</w:t>
+      </w:r>
+      <w:r>
+        <w:rPr>
+          <w:rFonts w:asciiTheme="minorHAnsi" w:hAnsiTheme="minorHAnsi"/>
+          <w:color w:val="1F497D" w:themeColor="text2"/>
+          <w:sz w:val="24"/>
+          <w:szCs w:val="24"/>
+        </w:rPr>
+        <w:t xml:space="preserve">he source-specific values are taken from either the </w:t>
+      </w:r>
+      <w:hyperlink r:id="rId6" w:history="1">
+        <w:r>
+          <w:rPr>
+            <w:rStyle w:val="Hyperlink"/>
+            <w:rFonts w:asciiTheme="minorHAnsi" w:hAnsiTheme="minorHAnsi"/>
+            <w:sz w:val="24"/>
+            <w:szCs w:val="24"/>
+          </w:rPr>
+          <w:t>Nasa Extragalactic Database</w:t>
+        </w:r>
+      </w:hyperlink>
+      <w:r>
+        <w:rPr>
+          <w:rFonts w:asciiTheme="minorHAnsi" w:hAnsiTheme="minorHAnsi"/>
+          <w:color w:val="1F497D" w:themeColor="text2"/>
+          <w:sz w:val="24"/>
+          <w:szCs w:val="24"/>
+        </w:rPr>
+        <w:t xml:space="preserve"> or recent publications on M87.  </w:t>
       </w:r>
     </w:p>
     <w:p>
       <w:pPr>
-        <w:rPr>
-          <w:rFonts w:asciiTheme="minorHAnsi" w:hAnsiTheme="minorHAnsi"/>
-          <w:color w:val="1F497D" w:themeColor="text2"/>
-        </w:rPr>
-      </w:pPr>
-    </w:p>
-    <w:tbl>
-      <w:tblPr>
-        <w:tblW w:w="9360" w:type="dxa"/>
-        <w:tblLayout w:type="fixed"/>
-        <w:tblLook w:val="04A0" w:firstRow="1" w:lastRow="0" w:firstColumn="1" w:lastColumn="0" w:noHBand="0" w:noVBand="1"/>
-      </w:tblPr>
-      <w:tblGrid>
-        <w:gridCol w:w="9360"/>
-      </w:tblGrid>
-      <w:tr>
-        <w:tc>
-          <w:tcPr>
-            <w:tcW w:w="9360" w:type="dxa"/>
-            <w:shd w:val="clear" w:color="auto" w:fill="F7F7F7"/>
-            <w:tcMar>
-              <w:top w:w="80" w:type="dxa"/>
-              <w:left w:w="120" w:type="dxa"/>
-              <w:bottom w:w="80" w:type="dxa"/>
-              <w:right w:w="120" w:type="dxa"/>
-            </w:tcMar>
-          </w:tcPr>
-          <w:p>
-            <w:pPr>
-              <w:spacing w:before="360" w:after="360"/>
-              <w:jc w:val="center"/>
-              <w:rPr>
-                <w:rFonts w:asciiTheme="minorHAnsi" w:hAnsiTheme="minorHAnsi"/>
-                <w:color w:val="1F497D" w:themeColor="text2"/>
-              </w:rPr>
-            </w:pPr>
-            <w:r>
-              <w:rPr>
-                <w:rFonts w:asciiTheme="minorHAnsi" w:hAnsiTheme="minorHAnsi"/>
-                <w:color w:val="1F497D" w:themeColor="text2"/>
-              </w:rPr>
-              <w:t>Screenshot box</w:t>
-            </w:r>
-          </w:p>
-        </w:tc>
-      </w:tr>
-    </w:tbl>
-    <w:p>
-      <w:pPr>
-        <w:rPr>
-          <w:rFonts w:asciiTheme="minorHAnsi" w:hAnsiTheme="minorHAnsi"/>
-          <w:color w:val="1F497D" w:themeColor="text2"/>
-        </w:rPr>
-      </w:pPr>
-      <w:r>
-        <w:rPr>
-          <w:rFonts w:asciiTheme="minorHAnsi" w:hAnsiTheme="minorHAnsi"/>
-          <w:color w:val="1F497D" w:themeColor="text2"/>
-        </w:rPr>
-        <w:br w:type="page"/>
-      </w:r>
+        <w:pStyle w:val="ListParagraph"/>
+        <w:spacing w:before="400" w:after="120"/>
+        <w:ind w:left="360"/>
+        <w:rPr>
+          <w:rFonts w:asciiTheme="minorHAnsi" w:hAnsiTheme="minorHAnsi"/>
+          <w:color w:val="1F497D" w:themeColor="text2"/>
+          <w:sz w:val="24"/>
+          <w:szCs w:val="24"/>
+        </w:rPr>
+      </w:pPr>
     </w:p>
     <w:p>
       <w:pPr>
+        <w:pStyle w:val="ListParagraph"/>
         <w:spacing w:before="400" w:after="120"/>
-        <w:rPr>
-          <w:rFonts w:asciiTheme="minorHAnsi" w:hAnsiTheme="minorHAnsi"/>
-          <w:color w:val="1F497D" w:themeColor="text2"/>
-          <w:sz w:val="24"/>
-          <w:szCs w:val="24"/>
-          <w:u w:val="single"/>
-        </w:rPr>
-      </w:pPr>
-      <w:r>
-        <w:rPr>
-          <w:rFonts w:asciiTheme="minorHAnsi" w:hAnsiTheme="minorHAnsi"/>
-          <w:color w:val="1F497D" w:themeColor="text2"/>
-          <w:sz w:val="24"/>
-          <w:szCs w:val="24"/>
-          <w:u w:val="single"/>
-        </w:rPr>
-        <w:lastRenderedPageBreak/>
-        <w:t xml:space="preserve">Emission from many zones (creating a stratified jet): </w:t>
-      </w:r>
-    </w:p>
-    <w:p>
-      <w:pPr>
-        <w:spacing w:before="400" w:after="120"/>
-        <w:rPr>
-          <w:rFonts w:asciiTheme="minorHAnsi" w:hAnsiTheme="minorHAnsi"/>
-          <w:color w:val="1F497D" w:themeColor="text2"/>
-          <w:sz w:val="24"/>
-          <w:szCs w:val="24"/>
-          <w:u w:val="single"/>
-        </w:rPr>
-      </w:pPr>
-    </w:p>
-    <w:p>
-      <w:pPr>
-        <w:spacing w:before="400" w:after="120"/>
-        <w:rPr>
-          <w:rFonts w:asciiTheme="minorHAnsi" w:hAnsiTheme="minorHAnsi"/>
-          <w:color w:val="1F497D" w:themeColor="text2"/>
-          <w:sz w:val="24"/>
-          <w:szCs w:val="24"/>
-          <w:u w:val="single"/>
-        </w:rPr>
-      </w:pPr>
-      <w:r>
-        <w:rPr>
-          <w:rFonts w:asciiTheme="minorHAnsi" w:hAnsiTheme="minorHAnsi"/>
-          <w:color w:val="1F497D" w:themeColor="text2"/>
-          <w:sz w:val="24"/>
-          <w:szCs w:val="24"/>
-          <w:u w:val="single"/>
-        </w:rPr>
-        <w:t xml:space="preserve">Compare single-zone and multi-zone </w:t>
-      </w:r>
-      <w:r>
-        <w:rPr>
-          <w:rFonts w:asciiTheme="minorHAnsi" w:hAnsiTheme="minorHAnsi"/>
-          <w:color w:val="1F497D" w:themeColor="text2"/>
-          <w:sz w:val="24"/>
-          <w:szCs w:val="24"/>
-          <w:u w:val="single"/>
-        </w:rPr>
-        <w:t>total emission</w:t>
-      </w:r>
-      <w:r>
-        <w:rPr>
-          <w:rFonts w:asciiTheme="minorHAnsi" w:hAnsiTheme="minorHAnsi"/>
-          <w:color w:val="1F497D" w:themeColor="text2"/>
-          <w:sz w:val="24"/>
-          <w:szCs w:val="24"/>
-          <w:u w:val="single"/>
-        </w:rPr>
-        <w:t xml:space="preserve">: </w:t>
-      </w:r>
-    </w:p>
-    <w:p>
-      <w:pPr>
-        <w:pStyle w:val="ListParagraph"/>
-        <w:rPr>
-          <w:rFonts w:asciiTheme="minorHAnsi" w:hAnsiTheme="minorHAnsi"/>
-          <w:bCs/>
-          <w:color w:val="1F497D" w:themeColor="text2"/>
+        <w:ind w:left="360"/>
+        <w:rPr>
+          <w:rFonts w:asciiTheme="minorHAnsi" w:hAnsiTheme="minorHAnsi"/>
+          <w:color w:val="1F497D" w:themeColor="text2"/>
+          <w:sz w:val="24"/>
+          <w:szCs w:val="24"/>
         </w:rPr>
       </w:pPr>
     </w:p>
@@ -2123,7 +3329,7 @@
         <w:pStyle w:val="ListParagraph"/>
         <w:numPr>
           <w:ilvl w:val="0"/>
-          <w:numId w:val="10"/>
+          <w:numId w:val="13"/>
         </w:numPr>
         <w:spacing w:before="400" w:after="120"/>
         <w:rPr>
@@ -2136,170 +3342,118 @@
       <w:r>
         <w:rPr>
           <w:rFonts w:asciiTheme="minorHAnsi" w:hAnsiTheme="minorHAnsi"/>
-          <w:bCs/>
-          <w:color w:val="1F497D" w:themeColor="text2"/>
-        </w:rPr>
-        <w:t xml:space="preserve">Before calculating: how do </w:t>
-      </w:r>
-      <w:r>
-        <w:rPr>
-          <w:rFonts w:asciiTheme="minorHAnsi" w:hAnsiTheme="minorHAnsi"/>
-          <w:bCs/>
-          <w:color w:val="1F497D" w:themeColor="text2"/>
-        </w:rPr>
-        <w:t>you</w:t>
-      </w:r>
-      <w:r>
-        <w:rPr>
-          <w:rFonts w:asciiTheme="minorHAnsi" w:hAnsiTheme="minorHAnsi"/>
-          <w:bCs/>
-          <w:color w:val="1F497D" w:themeColor="text2"/>
-        </w:rPr>
-        <w:t xml:space="preserve"> expect the multi-zone spectrum to differ from the single-zone spectrum?</w:t>
-      </w:r>
-      <w:r>
-        <w:rPr>
-          <w:rFonts w:asciiTheme="minorHAnsi" w:hAnsiTheme="minorHAnsi"/>
-          <w:bCs/>
-          <w:color w:val="1F497D" w:themeColor="text2"/>
-        </w:rPr>
-        <w:t xml:space="preserve"> </w:t>
+          <w:color w:val="1F497D" w:themeColor="text2"/>
+          <w:sz w:val="24"/>
+          <w:szCs w:val="24"/>
+        </w:rPr>
+        <w:t xml:space="preserve">Load and inspect the M87 SED </w:t>
       </w:r>
     </w:p>
     <w:p>
       <w:pPr>
         <w:pStyle w:val="ListParagraph"/>
-        <w:spacing w:before="400" w:after="120"/>
-        <w:ind w:left="360"/>
-        <w:rPr>
-          <w:rFonts w:asciiTheme="minorHAnsi" w:hAnsiTheme="minorHAnsi"/>
-          <w:color w:val="1F497D" w:themeColor="text2"/>
-          <w:sz w:val="24"/>
-          <w:szCs w:val="24"/>
-        </w:rPr>
-      </w:pPr>
-    </w:p>
-    <w:p>
-      <w:pPr>
-        <w:pStyle w:val="ListParagraph"/>
         <w:numPr>
-          <w:ilvl w:val="0"/>
-          <w:numId w:val="10"/>
+          <w:ilvl w:val="1"/>
+          <w:numId w:val="13"/>
         </w:numPr>
         <w:spacing w:before="400" w:after="120"/>
-        <w:rPr>
-          <w:rFonts w:asciiTheme="minorHAnsi" w:hAnsiTheme="minorHAnsi"/>
-          <w:color w:val="1F497D" w:themeColor="text2"/>
-          <w:sz w:val="24"/>
-          <w:szCs w:val="24"/>
-        </w:rPr>
-      </w:pPr>
-      <w:r>
-        <w:rPr>
-          <w:rFonts w:asciiTheme="minorHAnsi" w:hAnsiTheme="minorHAnsi"/>
-          <w:color w:val="1F497D" w:themeColor="text2"/>
-        </w:rPr>
-        <w:t xml:space="preserve">What do you have to change in the parameter space to get the multi-zone and single </w:t>
-      </w:r>
-      <w:proofErr w:type="gramStart"/>
-      <w:r>
-        <w:rPr>
-          <w:rFonts w:asciiTheme="minorHAnsi" w:hAnsiTheme="minorHAnsi"/>
-          <w:color w:val="1F497D" w:themeColor="text2"/>
-        </w:rPr>
-        <w:t xml:space="preserve">zone </w:t>
-      </w:r>
-      <w:r>
-        <w:rPr>
-          <w:rFonts w:asciiTheme="minorHAnsi" w:hAnsiTheme="minorHAnsi"/>
-          <w:color w:val="1F497D" w:themeColor="text2"/>
+        <w:ind w:left="1080"/>
+        <w:rPr>
+          <w:rFonts w:asciiTheme="minorHAnsi" w:hAnsiTheme="minorHAnsi"/>
+          <w:color w:val="1F497D" w:themeColor="text2"/>
+          <w:sz w:val="24"/>
+          <w:szCs w:val="24"/>
+        </w:rPr>
+      </w:pPr>
+      <w:r>
+        <w:rPr>
+          <w:rFonts w:asciiTheme="minorHAnsi" w:hAnsiTheme="minorHAnsi"/>
+          <w:color w:val="1F497D" w:themeColor="text2"/>
+          <w:sz w:val="24"/>
+          <w:szCs w:val="24"/>
+        </w:rPr>
+        <w:t>The data from the file is in units of energy (eV) and number flux (</w:t>
+      </w:r>
+      <w:proofErr w:type="spellStart"/>
+      <w:r>
+        <w:rPr>
+          <w:rFonts w:asciiTheme="minorHAnsi" w:hAnsiTheme="minorHAnsi"/>
+          <w:color w:val="1F497D" w:themeColor="text2"/>
+          <w:sz w:val="24"/>
+          <w:szCs w:val="24"/>
+        </w:rPr>
+        <w:t>dN</w:t>
+      </w:r>
+      <w:proofErr w:type="spellEnd"/>
+      <w:r>
+        <w:rPr>
+          <w:rFonts w:asciiTheme="minorHAnsi" w:hAnsiTheme="minorHAnsi"/>
+          <w:color w:val="1F497D" w:themeColor="text2"/>
+          <w:sz w:val="24"/>
+          <w:szCs w:val="24"/>
+        </w:rPr>
+        <w:t>/</w:t>
+      </w:r>
+      <w:proofErr w:type="spellStart"/>
+      <w:r>
+        <w:rPr>
+          <w:rFonts w:asciiTheme="minorHAnsi" w:hAnsiTheme="minorHAnsi"/>
+          <w:color w:val="1F497D" w:themeColor="text2"/>
+          <w:sz w:val="24"/>
+          <w:szCs w:val="24"/>
+        </w:rPr>
+        <w:t>dE</w:t>
+      </w:r>
+      <w:proofErr w:type="spellEnd"/>
+      <w:r>
+        <w:rPr>
+          <w:rFonts w:asciiTheme="minorHAnsi" w:hAnsiTheme="minorHAnsi"/>
+          <w:color w:val="1F497D" w:themeColor="text2"/>
+          <w:sz w:val="24"/>
+          <w:szCs w:val="24"/>
+        </w:rPr>
+        <w:t xml:space="preserve">) (and flux error). However, it is common to use E^2 </w:t>
+      </w:r>
+      <w:proofErr w:type="spellStart"/>
+      <w:r>
+        <w:rPr>
+          <w:rFonts w:asciiTheme="minorHAnsi" w:hAnsiTheme="minorHAnsi"/>
+          <w:color w:val="1F497D" w:themeColor="text2"/>
+          <w:sz w:val="24"/>
+          <w:szCs w:val="24"/>
+        </w:rPr>
+        <w:t>dN</w:t>
+      </w:r>
+      <w:proofErr w:type="spellEnd"/>
+      <w:r>
+        <w:rPr>
+          <w:rFonts w:asciiTheme="minorHAnsi" w:hAnsiTheme="minorHAnsi"/>
+          <w:color w:val="1F497D" w:themeColor="text2"/>
+          <w:sz w:val="24"/>
+          <w:szCs w:val="24"/>
+        </w:rPr>
+        <w:t>/</w:t>
+      </w:r>
+      <w:proofErr w:type="spellStart"/>
+      <w:r>
+        <w:rPr>
+          <w:rFonts w:asciiTheme="minorHAnsi" w:hAnsiTheme="minorHAnsi"/>
+          <w:color w:val="1F497D" w:themeColor="text2"/>
+          <w:sz w:val="24"/>
+          <w:szCs w:val="24"/>
+        </w:rPr>
+        <w:t>dE</w:t>
+      </w:r>
+      <w:proofErr w:type="spellEnd"/>
+      <w:r>
+        <w:rPr>
+          <w:rFonts w:asciiTheme="minorHAnsi" w:hAnsiTheme="minorHAnsi"/>
+          <w:color w:val="1F497D" w:themeColor="text2"/>
+          <w:sz w:val="24"/>
+          <w:szCs w:val="24"/>
         </w:rPr>
         <w:t xml:space="preserve"> </w:t>
       </w:r>
-      <w:r>
-        <w:rPr>
-          <w:rFonts w:asciiTheme="minorHAnsi" w:hAnsiTheme="minorHAnsi"/>
-          <w:color w:val="1F497D" w:themeColor="text2"/>
-        </w:rPr>
-        <w:t>models</w:t>
-      </w:r>
-      <w:proofErr w:type="gramEnd"/>
-      <w:r>
-        <w:rPr>
-          <w:rFonts w:asciiTheme="minorHAnsi" w:hAnsiTheme="minorHAnsi"/>
-          <w:color w:val="1F497D" w:themeColor="text2"/>
-        </w:rPr>
-        <w:t xml:space="preserve"> to have a similar flux/magnitude? </w:t>
-      </w:r>
-    </w:p>
-    <w:p>
-      <w:pPr>
-        <w:rPr>
-          <w:rFonts w:asciiTheme="minorHAnsi" w:hAnsiTheme="minorHAnsi"/>
-          <w:color w:val="1F497D" w:themeColor="text2"/>
-        </w:rPr>
-      </w:pPr>
-    </w:p>
-    <w:tbl>
-      <w:tblPr>
-        <w:tblW w:w="9360" w:type="dxa"/>
-        <w:tblLayout w:type="fixed"/>
-        <w:tblLook w:val="04A0" w:firstRow="1" w:lastRow="0" w:firstColumn="1" w:lastColumn="0" w:noHBand="0" w:noVBand="1"/>
-      </w:tblPr>
-      <w:tblGrid>
-        <w:gridCol w:w="9360"/>
-      </w:tblGrid>
-      <w:tr>
-        <w:tc>
-          <w:tcPr>
-            <w:tcW w:w="9360" w:type="dxa"/>
-            <w:shd w:val="clear" w:color="auto" w:fill="F7F7F7"/>
-            <w:tcMar>
-              <w:top w:w="80" w:type="dxa"/>
-              <w:left w:w="120" w:type="dxa"/>
-              <w:bottom w:w="80" w:type="dxa"/>
-              <w:right w:w="120" w:type="dxa"/>
-            </w:tcMar>
-          </w:tcPr>
-          <w:p>
-            <w:pPr>
-              <w:spacing w:before="360" w:after="360"/>
-              <w:jc w:val="center"/>
-              <w:rPr>
-                <w:rFonts w:asciiTheme="minorHAnsi" w:hAnsiTheme="minorHAnsi"/>
-                <w:color w:val="1F497D" w:themeColor="text2"/>
-              </w:rPr>
-            </w:pPr>
-            <w:proofErr w:type="gramStart"/>
-            <w:r>
-              <w:rPr>
-                <w:rFonts w:asciiTheme="minorHAnsi" w:hAnsiTheme="minorHAnsi"/>
-                <w:color w:val="1F497D" w:themeColor="text2"/>
-                <w:sz w:val="20"/>
-              </w:rPr>
-              <w:t>Screenshot  box</w:t>
-            </w:r>
-            <w:proofErr w:type="gramEnd"/>
-            <w:r>
-              <w:rPr>
-                <w:rFonts w:asciiTheme="minorHAnsi" w:hAnsiTheme="minorHAnsi"/>
-                <w:color w:val="1F497D" w:themeColor="text2"/>
-                <w:sz w:val="20"/>
-              </w:rPr>
-              <w:t xml:space="preserve"> </w:t>
-            </w:r>
-          </w:p>
-        </w:tc>
-      </w:tr>
-    </w:tbl>
-    <w:p>
-      <w:pPr>
-        <w:spacing w:after="80"/>
-        <w:rPr>
-          <w:rFonts w:asciiTheme="minorHAnsi" w:hAnsiTheme="minorHAnsi"/>
-          <w:color w:val="1F497D" w:themeColor="text2"/>
-        </w:rPr>
-      </w:pPr>
     </w:p>
     <w:p>
       <w:pPr>
@@ -2320,7 +3474,7 @@
 </file>
 
 <file path=word/numbering.xml><?xml version="1.0" encoding="utf-8"?>
-<w:numbering xmlns:wpc="http://schemas.microsoft.com/office/word/2010/wordprocessingCanvas" xmlns:cx="http://schemas.microsoft.com/office/drawing/2014/chartex" xmlns:cx1="http://schemas.microsoft.com/office/drawing/2015/9/8/chartex" xmlns:cx2="http://schemas.microsoft.com/office/drawing/2015/10/21/chartex" xmlns:cx3="http://schemas.microsoft.com/office/drawing/2016/5/9/chartex" xmlns:cx4="http://schemas.microsoft.com/office/drawing/2016/5/10/chartex" xmlns:cx5="http://schemas.microsoft.com/office/drawing/2016/5/11/chartex" xmlns:cx6="http://schemas.microsoft.com/office/drawing/2016/5/12/chartex" xmlns:cx7="http://schemas.microsoft.com/office/drawing/2016/5/13/chartex" xmlns:cx8="http://schemas.microsoft.com/office/drawing/2016/5/14/chartex" xmlns:mc="http://schemas.openxmlformats.org/markup-compatibility/2006" xmlns:m="http://schemas.openxmlformats.org/officeDocument/2006/math" xmlns:aink="http://schemas.microsoft.com/office/drawing/2016/ink" xmlns:am3d="http://schemas.microsoft.com/office/drawing/2017/model3d" xmlns:oel="http://schemas.microsoft.com/office/2019/extlst" xmlns:r="http://schemas.openxmlformats.org/officeDocument/2006/relationships" xmlns:wp14="http://schemas.microsoft.com/office/word/2010/wordprocessingDrawing" xmlns:wp="http://schemas.openxmlformats.org/drawingml/2006/wordprocessingDrawing" xmlns:wpg="http://schemas.microsoft.com/office/word/2010/wordprocessingGroup" xmlns:wpi="http://schemas.microsoft.com/office/word/2010/wordprocessingInk" xmlns:wps="http://schemas.microsoft.com/office/word/2010/wordprocessingShape" xmlns:o="urn:schemas-microsoft-com:office:office" xmlns:v="urn:schemas-microsoft-com:vml" xmlns:w10="urn:schemas-microsoft-com:office:word" xmlns:w="http://schemas.openxmlformats.org/wordprocessingml/2006/main" xmlns:w14="http://schemas.microsoft.com/office/word/2010/wordml" xmlns:w15="http://schemas.microsoft.com/office/word/2012/wordml" xmlns:w16cei="http://schemas.microsoft.com/office/word/2026/wordml/cei" xmlns:w16cex="http://schemas.microsoft.com/office/word/2018/wordml/cex" xmlns:w16cid="http://schemas.microsoft.com/office/word/2016/wordml/cid" xmlns:w16="http://schemas.microsoft.com/office/word/2018/wordml" xmlns:w16sdtdh="http://schemas.microsoft.com/office/word/2020/wordml/sdtdatahash" xmlns:w16sdtfl="http://schemas.microsoft.com/office/word/2024/wordml/sdtformatlock" xmlns:w16se="http://schemas.microsoft.com/office/word/2015/wordml/symex" xmlns:w16du="http://schemas.microsoft.com/office/word/2023/wordml/word16du" xmlns:wne="http://schemas.microsoft.com/office/word/2006/wordml" mc:Ignorable="w14 w15 w16se w16cid w16 w16cex w16sdtdh w16sdtfl w16du wp14">
+<w:numbering xmlns:wpc="http://schemas.microsoft.com/office/word/2010/wordprocessingCanvas" xmlns:cx="http://schemas.microsoft.com/office/drawing/2014/chartex" xmlns:cx1="http://schemas.microsoft.com/office/drawing/2015/9/8/chartex" xmlns:cx2="http://schemas.microsoft.com/office/drawing/2015/10/21/chartex" xmlns:cx3="http://schemas.microsoft.com/office/drawing/2016/5/9/chartex" xmlns:cx4="http://schemas.microsoft.com/office/drawing/2016/5/10/chartex" xmlns:cx5="http://schemas.microsoft.com/office/drawing/2016/5/11/chartex" xmlns:cx6="http://schemas.microsoft.com/office/drawing/2016/5/12/chartex" xmlns:cx7="http://schemas.microsoft.com/office/drawing/2016/5/13/chartex" xmlns:cx8="http://schemas.microsoft.com/office/drawing/2016/5/14/chartex" xmlns:mc="http://schemas.openxmlformats.org/markup-compatibility/2006" xmlns:m="http://schemas.openxmlformats.org/officeDocument/2006/math" xmlns:aink="http://schemas.microsoft.com/office/drawing/2016/ink" xmlns:am3d="http://schemas.microsoft.com/office/drawing/2017/model3d" xmlns:oel="http://schemas.microsoft.com/office/2019/extlst" xmlns:r="http://schemas.openxmlformats.org/officeDocument/2006/relationships" xmlns:wp14="http://schemas.microsoft.com/office/word/2010/wordprocessingDrawing" xmlns:wp="http://schemas.openxmlformats.org/drawingml/2006/wordprocessingDrawing" xmlns:wpg="http://schemas.microsoft.com/office/word/2010/wordprocessingGroup" xmlns:wpi="http://schemas.microsoft.com/office/word/2010/wordprocessingInk" xmlns:wps="http://schemas.microsoft.com/office/word/2010/wordprocessingShape" xmlns:o="urn:schemas-microsoft-com:office:office" xmlns:v="urn:schemas-microsoft-com:vml" xmlns:w10="urn:schemas-microsoft-com:office:word" xmlns:w="http://schemas.openxmlformats.org/wordprocessingml/2006/main" xmlns:w14="http://schemas.microsoft.com/office/word/2010/wordml" xmlns:w15="http://schemas.microsoft.com/office/word/2012/wordml" xmlns:w16cex="http://schemas.microsoft.com/office/word/2018/wordml/cex" xmlns:w16cid="http://schemas.microsoft.com/office/word/2016/wordml/cid" xmlns:w16="http://schemas.microsoft.com/office/word/2018/wordml" xmlns:w16sdtdh="http://schemas.microsoft.com/office/word/2020/wordml/sdtdatahash" xmlns:w16sdtfl="http://schemas.microsoft.com/office/word/2024/wordml/sdtformatlock" xmlns:w16se="http://schemas.microsoft.com/office/word/2015/wordml/symex" xmlns:w16du="http://schemas.microsoft.com/office/word/2023/wordml/word16du" xmlns:wne="http://schemas.microsoft.com/office/word/2006/wordml" mc:Ignorable="w14 w15 w16se w16cid w16 w16cex w16sdtdh w16sdtfl w16du wp14">
   <w:abstractNum w:abstractNumId="0" w15:restartNumberingAfterBreak="0">
     <w:nsid w:val="FFFFFF7C"/>
     <w:multiLevelType w:val="singleLevel"/>
@@ -2584,8 +3738,8 @@
   <w:abstractNum w:abstractNumId="10" w15:restartNumberingAfterBreak="0">
     <w:nsid w:val="25655981"/>
     <w:multiLevelType w:val="hybridMultilevel"/>
-    <w:tmpl w:val="99561E9A"/>
-    <w:lvl w:ilvl="0" w:tplc="0409000F">
+    <w:tmpl w:val="FC527012"/>
+    <w:lvl w:ilvl="0" w:tplc="E6F27E08">
       <w:start w:val="1"/>
       <w:numFmt w:val="decimal"/>
       <w:lvlText w:val="%1."/>
@@ -2595,6 +3749,8 @@
       </w:pPr>
       <w:rPr>
         <w:rFonts w:hint="default"/>
+        <w:b w:val="0"/>
+        <w:bCs w:val="0"/>
       </w:rPr>
     </w:lvl>
     <w:lvl w:ilvl="1" w:tplc="04090019">
@@ -2781,6 +3937,95 @@
       <w:rPr>
         <w:rFonts w:ascii="Wingdings" w:hAnsi="Wingdings" w:hint="default"/>
       </w:rPr>
+    </w:lvl>
+  </w:abstractNum>
+  <w:abstractNum w:abstractNumId="12" w15:restartNumberingAfterBreak="0">
+    <w:nsid w:val="73AC5A2F"/>
+    <w:multiLevelType w:val="hybridMultilevel"/>
+    <w:tmpl w:val="298EB0B0"/>
+    <w:lvl w:ilvl="0" w:tplc="0409000F">
+      <w:start w:val="1"/>
+      <w:numFmt w:val="decimal"/>
+      <w:lvlText w:val="%1."/>
+      <w:lvlJc w:val="left"/>
+      <w:pPr>
+        <w:ind w:left="720" w:hanging="360"/>
+      </w:pPr>
+      <w:rPr>
+        <w:rFonts w:hint="default"/>
+      </w:rPr>
+    </w:lvl>
+    <w:lvl w:ilvl="1" w:tplc="04090019">
+      <w:start w:val="1"/>
+      <w:numFmt w:val="lowerLetter"/>
+      <w:lvlText w:val="%2."/>
+      <w:lvlJc w:val="left"/>
+      <w:pPr>
+        <w:ind w:left="1440" w:hanging="360"/>
+      </w:pPr>
+    </w:lvl>
+    <w:lvl w:ilvl="2" w:tplc="0409001B" w:tentative="1">
+      <w:start w:val="1"/>
+      <w:numFmt w:val="lowerRoman"/>
+      <w:lvlText w:val="%3."/>
+      <w:lvlJc w:val="right"/>
+      <w:pPr>
+        <w:ind w:left="2160" w:hanging="180"/>
+      </w:pPr>
+    </w:lvl>
+    <w:lvl w:ilvl="3" w:tplc="0409000F" w:tentative="1">
+      <w:start w:val="1"/>
+      <w:numFmt w:val="decimal"/>
+      <w:lvlText w:val="%4."/>
+      <w:lvlJc w:val="left"/>
+      <w:pPr>
+        <w:ind w:left="2880" w:hanging="360"/>
+      </w:pPr>
+    </w:lvl>
+    <w:lvl w:ilvl="4" w:tplc="04090019" w:tentative="1">
+      <w:start w:val="1"/>
+      <w:numFmt w:val="lowerLetter"/>
+      <w:lvlText w:val="%5."/>
+      <w:lvlJc w:val="left"/>
+      <w:pPr>
+        <w:ind w:left="3600" w:hanging="360"/>
+      </w:pPr>
+    </w:lvl>
+    <w:lvl w:ilvl="5" w:tplc="0409001B" w:tentative="1">
+      <w:start w:val="1"/>
+      <w:numFmt w:val="lowerRoman"/>
+      <w:lvlText w:val="%6."/>
+      <w:lvlJc w:val="right"/>
+      <w:pPr>
+        <w:ind w:left="4320" w:hanging="180"/>
+      </w:pPr>
+    </w:lvl>
+    <w:lvl w:ilvl="6" w:tplc="0409000F" w:tentative="1">
+      <w:start w:val="1"/>
+      <w:numFmt w:val="decimal"/>
+      <w:lvlText w:val="%7."/>
+      <w:lvlJc w:val="left"/>
+      <w:pPr>
+        <w:ind w:left="5040" w:hanging="360"/>
+      </w:pPr>
+    </w:lvl>
+    <w:lvl w:ilvl="7" w:tplc="04090019" w:tentative="1">
+      <w:start w:val="1"/>
+      <w:numFmt w:val="lowerLetter"/>
+      <w:lvlText w:val="%8."/>
+      <w:lvlJc w:val="left"/>
+      <w:pPr>
+        <w:ind w:left="5760" w:hanging="360"/>
+      </w:pPr>
+    </w:lvl>
+    <w:lvl w:ilvl="8" w:tplc="0409001B" w:tentative="1">
+      <w:start w:val="1"/>
+      <w:numFmt w:val="lowerRoman"/>
+      <w:lvlText w:val="%9."/>
+      <w:lvlJc w:val="right"/>
+      <w:pPr>
+        <w:ind w:left="6480" w:hanging="180"/>
+      </w:pPr>
     </w:lvl>
   </w:abstractNum>
   <w:num w:numId="1" w16cid:durableId="19473500">
@@ -2818,6 +4063,9 @@
   </w:num>
   <w:num w:numId="12" w16cid:durableId="891622130">
     <w:abstractNumId w:val="11"/>
+  </w:num>
+  <w:num w:numId="13" w16cid:durableId="1710256686">
+    <w:abstractNumId w:val="12"/>
   </w:num>
 </w:numbering>
 </file>
@@ -14218,6 +15466,29 @@
       <w:szCs w:val="20"/>
     </w:rPr>
   </w:style>
+  <w:style w:type="character" w:styleId="Hyperlink">
+    <w:name w:val="Hyperlink"/>
+    <w:basedOn w:val="DefaultParagraphFont"/>
+    <w:uiPriority w:val="99"/>
+    <w:unhideWhenUsed/>
+    <w:rsid w:val="00D63ECD"/>
+    <w:rPr>
+      <w:color w:val="0000FF" w:themeColor="hyperlink"/>
+      <w:u w:val="single"/>
+    </w:rPr>
+  </w:style>
+  <w:style w:type="character" w:styleId="UnresolvedMention">
+    <w:name w:val="Unresolved Mention"/>
+    <w:basedOn w:val="DefaultParagraphFont"/>
+    <w:uiPriority w:val="99"/>
+    <w:semiHidden/>
+    <w:unhideWhenUsed/>
+    <w:rsid w:val="00D63ECD"/>
+    <w:rPr>
+      <w:color w:val="605E5C"/>
+      <w:shd w:val="clear" w:color="auto" w:fill="E1DFDD"/>
+    </w:rPr>
+  </w:style>
 </w:styles>
 </file>
 

</xml_diff>